<commit_message>
Add agent conversation test screenshots to documentation
Captures the end-to-end run through the Agentforce agent: subagent
selection, action launch, and the returned priority for both the High
and Low branches.

Co-Authored-By: Claude <noreply@anthropic.com>
</commit_message>
<xml_diff>
--- a/Customer Support Ticket Priority Prediction - Project Documentation.docx
+++ b/Customer Support Ticket Priority Prediction - Project Documentation.docx
@@ -2269,7 +2269,129 @@
     <w:p/>
     <w:p>
       <w:r>
-        <w:t>Only the High priority ticket produced a task, which is the specified behaviour. Medium and Low tickets are classified and queued without paging an agent.</w:t>
+        <w:t>Only the High priority ticket produced a task, which is the specified behaviour. Medium and Low tickets are classified and queued without paging an agent. The flow also writes the predicted priority back to the ticket record and flags SLA breach risk for anything raised more than two days ago.</w:t>
+      </w:r>
+    </w:p>
+    <w:p>
+      <w:pPr>
+        <w:pStyle w:val="Heading2"/>
+      </w:pPr>
+      <w:r>
+        <w:t>End-to-end test through the agent</w:t>
+      </w:r>
+    </w:p>
+    <w:p>
+      <w:r>
+        <w:t>The flow was also exercised through the agent conversation, which is the real test of the system: the agent must pick the right subagent, call the flow with the user's input, and report the result back in plain language.</w:t>
+      </w:r>
+    </w:p>
+    <w:p>
+      <w:r>
+        <w:t>Asking "What is the priority of the support ticket for Acme Corporation?" produced: Subagent Selected — Support Ticket Priority Analysis, then Action Launched — Support Ticket Intelligence (0.63 sec) with input {"varAccountName": "Acme Corporation"} and output returning varPriorityLevel "High".</w:t>
+      </w:r>
+    </w:p>
+    <w:p>
+      <w:pPr>
+        <w:jc w:val="center"/>
+      </w:pPr>
+      <w:r>
+        <w:drawing>
+          <wp:inline xmlns:a="http://schemas.openxmlformats.org/drawingml/2006/main" xmlns:pic="http://schemas.openxmlformats.org/drawingml/2006/picture">
+            <wp:extent cx="5760720" cy="2991374"/>
+            <wp:docPr id="10" name="Picture 10"/>
+            <wp:cNvGraphicFramePr>
+              <a:graphicFrameLocks noChangeAspect="1"/>
+            </wp:cNvGraphicFramePr>
+            <a:graphic>
+              <a:graphicData uri="http://schemas.openxmlformats.org/drawingml/2006/picture">
+                <pic:pic>
+                  <pic:nvPicPr>
+                    <pic:cNvPr id="0" name="23_agent_test_high.png"/>
+                    <pic:cNvPicPr/>
+                  </pic:nvPicPr>
+                  <pic:blipFill>
+                    <a:blip r:embed="rId18"/>
+                    <a:stretch>
+                      <a:fillRect/>
+                    </a:stretch>
+                  </pic:blipFill>
+                  <pic:spPr>
+                    <a:xfrm>
+                      <a:off x="0" y="0"/>
+                      <a:ext cx="5760720" cy="2991374"/>
+                    </a:xfrm>
+                    <a:prstGeom prst="rect"/>
+                  </pic:spPr>
+                </pic:pic>
+              </a:graphicData>
+            </a:graphic>
+          </wp:inline>
+        </w:drawing>
+      </w:r>
+    </w:p>
+    <w:p>
+      <w:pPr>
+        <w:jc w:val="center"/>
+      </w:pPr>
+      <w:r>
+        <w:rPr>
+          <w:i/>
+          <w:color w:val="555555"/>
+          <w:sz w:val="18"/>
+        </w:rPr>
+        <w:t>Agent conversation: the High branch, showing subagent and action selection.</w:t>
+      </w:r>
+    </w:p>
+    <w:p>
+      <w:pPr>
+        <w:jc w:val="center"/>
+      </w:pPr>
+      <w:r>
+        <w:drawing>
+          <wp:inline xmlns:a="http://schemas.openxmlformats.org/drawingml/2006/main" xmlns:pic="http://schemas.openxmlformats.org/drawingml/2006/picture">
+            <wp:extent cx="5760720" cy="5390041"/>
+            <wp:docPr id="11" name="Picture 11"/>
+            <wp:cNvGraphicFramePr>
+              <a:graphicFrameLocks noChangeAspect="1"/>
+            </wp:cNvGraphicFramePr>
+            <a:graphic>
+              <a:graphicData uri="http://schemas.openxmlformats.org/drawingml/2006/picture">
+                <pic:pic>
+                  <pic:nvPicPr>
+                    <pic:cNvPr id="0" name="24_agent_test_low.png"/>
+                    <pic:cNvPicPr/>
+                  </pic:nvPicPr>
+                  <pic:blipFill>
+                    <a:blip r:embed="rId19"/>
+                    <a:stretch>
+                      <a:fillRect/>
+                    </a:stretch>
+                  </pic:blipFill>
+                  <pic:spPr>
+                    <a:xfrm>
+                      <a:off x="0" y="0"/>
+                      <a:ext cx="5760720" cy="5390041"/>
+                    </a:xfrm>
+                    <a:prstGeom prst="rect"/>
+                  </pic:spPr>
+                </pic:pic>
+              </a:graphicData>
+            </a:graphic>
+          </wp:inline>
+        </w:drawing>
+      </w:r>
+    </w:p>
+    <w:p>
+      <w:pPr>
+        <w:jc w:val="center"/>
+      </w:pPr>
+      <w:r>
+        <w:rPr>
+          <w:i/>
+          <w:color w:val="555555"/>
+          <w:sz w:val="18"/>
+        </w:rPr>
+        <w:t>Agent conversation: the Low branch for Initech Solutions.</w:t>
       </w:r>
     </w:p>
     <w:p>

</xml_diff>

<commit_message>
Add All Tickets list view screenshot to documentation
The list view now renders all three tickets with their predicted
priorities, contacts and the SLA breach flag.

Co-Authored-By: Claude <noreply@anthropic.com>
</commit_message>
<xml_diff>
--- a/Customer Support Ticket Priority Prediction - Project Documentation.docx
+++ b/Customer Support Ticket Priority Prediction - Project Documentation.docx
@@ -1200,8 +1200,60 @@
       <w:r>
         <w:drawing>
           <wp:inline xmlns:a="http://schemas.openxmlformats.org/drawingml/2006/main" xmlns:pic="http://schemas.openxmlformats.org/drawingml/2006/picture">
+            <wp:extent cx="5760720" cy="3159395"/>
+            <wp:docPr id="4" name="Picture 4"/>
+            <wp:cNvGraphicFramePr>
+              <a:graphicFrameLocks noChangeAspect="1"/>
+            </wp:cNvGraphicFramePr>
+            <a:graphic>
+              <a:graphicData uri="http://schemas.openxmlformats.org/drawingml/2006/picture">
+                <pic:pic>
+                  <pic:nvPicPr>
+                    <pic:cNvPr id="0" name="14_ticket_list_all.png"/>
+                    <pic:cNvPicPr/>
+                  </pic:nvPicPr>
+                  <pic:blipFill>
+                    <a:blip r:embed="rId12"/>
+                    <a:stretch>
+                      <a:fillRect/>
+                    </a:stretch>
+                  </pic:blipFill>
+                  <pic:spPr>
+                    <a:xfrm>
+                      <a:off x="0" y="0"/>
+                      <a:ext cx="5760720" cy="3159395"/>
+                    </a:xfrm>
+                    <a:prstGeom prst="rect"/>
+                  </pic:spPr>
+                </pic:pic>
+              </a:graphicData>
+            </a:graphic>
+          </wp:inline>
+        </w:drawing>
+      </w:r>
+    </w:p>
+    <w:p>
+      <w:pPr>
+        <w:jc w:val="center"/>
+      </w:pPr>
+      <w:r>
+        <w:rPr>
+          <w:i/>
+          <w:color w:val="555555"/>
+          <w:sz w:val="18"/>
+        </w:rPr>
+        <w:t>All Tickets list view. TKT-0001 shows Priority High with SLA Breach Risk ticked; the newer tickets sit at Medium and Low.</w:t>
+      </w:r>
+    </w:p>
+    <w:p>
+      <w:pPr>
+        <w:jc w:val="center"/>
+      </w:pPr>
+      <w:r>
+        <w:drawing>
+          <wp:inline xmlns:a="http://schemas.openxmlformats.org/drawingml/2006/main" xmlns:pic="http://schemas.openxmlformats.org/drawingml/2006/picture">
             <wp:extent cx="5760720" cy="3600450"/>
-            <wp:docPr id="4" name="Picture 4"/>
+            <wp:docPr id="5" name="Picture 5"/>
             <wp:cNvGraphicFramePr>
               <a:graphicFrameLocks noChangeAspect="1"/>
             </wp:cNvGraphicFramePr>
@@ -1213,7 +1265,7 @@
                     <pic:cNvPicPr/>
                   </pic:nvPicPr>
                   <pic:blipFill>
-                    <a:blip r:embed="rId12"/>
+                    <a:blip r:embed="rId13"/>
                     <a:stretch>
                       <a:fillRect/>
                     </a:stretch>
@@ -1650,7 +1702,7 @@
         <w:drawing>
           <wp:inline xmlns:a="http://schemas.openxmlformats.org/drawingml/2006/main" xmlns:pic="http://schemas.openxmlformats.org/drawingml/2006/picture">
             <wp:extent cx="5760720" cy="3600450"/>
-            <wp:docPr id="5" name="Picture 5"/>
+            <wp:docPr id="6" name="Picture 6"/>
             <wp:cNvGraphicFramePr>
               <a:graphicFrameLocks noChangeAspect="1"/>
             </wp:cNvGraphicFramePr>
@@ -1662,7 +1714,7 @@
                     <pic:cNvPicPr/>
                   </pic:nvPicPr>
                   <pic:blipFill>
-                    <a:blip r:embed="rId13"/>
+                    <a:blip r:embed="rId14"/>
                     <a:stretch>
                       <a:fillRect/>
                     </a:stretch>
@@ -1808,7 +1860,7 @@
         <w:drawing>
           <wp:inline xmlns:a="http://schemas.openxmlformats.org/drawingml/2006/main" xmlns:pic="http://schemas.openxmlformats.org/drawingml/2006/picture">
             <wp:extent cx="5760720" cy="3600450"/>
-            <wp:docPr id="6" name="Picture 6"/>
+            <wp:docPr id="7" name="Picture 7"/>
             <wp:cNvGraphicFramePr>
               <a:graphicFrameLocks noChangeAspect="1"/>
             </wp:cNvGraphicFramePr>
@@ -1820,7 +1872,7 @@
                     <pic:cNvPicPr/>
                   </pic:nvPicPr>
                   <pic:blipFill>
-                    <a:blip r:embed="rId14"/>
+                    <a:blip r:embed="rId15"/>
                     <a:stretch>
                       <a:fillRect/>
                     </a:stretch>
@@ -1860,7 +1912,7 @@
         <w:drawing>
           <wp:inline xmlns:a="http://schemas.openxmlformats.org/drawingml/2006/main" xmlns:pic="http://schemas.openxmlformats.org/drawingml/2006/picture">
             <wp:extent cx="5760720" cy="2991374"/>
-            <wp:docPr id="7" name="Picture 7"/>
+            <wp:docPr id="8" name="Picture 8"/>
             <wp:cNvGraphicFramePr>
               <a:graphicFrameLocks noChangeAspect="1"/>
             </wp:cNvGraphicFramePr>
@@ -1872,7 +1924,7 @@
                     <pic:cNvPicPr/>
                   </pic:nvPicPr>
                   <pic:blipFill>
-                    <a:blip r:embed="rId15"/>
+                    <a:blip r:embed="rId16"/>
                     <a:stretch>
                       <a:fillRect/>
                     </a:stretch>
@@ -1912,7 +1964,7 @@
         <w:drawing>
           <wp:inline xmlns:a="http://schemas.openxmlformats.org/drawingml/2006/main" xmlns:pic="http://schemas.openxmlformats.org/drawingml/2006/picture">
             <wp:extent cx="5760720" cy="2991374"/>
-            <wp:docPr id="8" name="Picture 8"/>
+            <wp:docPr id="9" name="Picture 9"/>
             <wp:cNvGraphicFramePr>
               <a:graphicFrameLocks noChangeAspect="1"/>
             </wp:cNvGraphicFramePr>
@@ -1924,7 +1976,7 @@
                     <pic:cNvPicPr/>
                   </pic:nvPicPr>
                   <pic:blipFill>
-                    <a:blip r:embed="rId16"/>
+                    <a:blip r:embed="rId17"/>
                     <a:stretch>
                       <a:fillRect/>
                     </a:stretch>
@@ -1964,7 +2016,7 @@
         <w:drawing>
           <wp:inline xmlns:a="http://schemas.openxmlformats.org/drawingml/2006/main" xmlns:pic="http://schemas.openxmlformats.org/drawingml/2006/picture">
             <wp:extent cx="5760720" cy="2991374"/>
-            <wp:docPr id="9" name="Picture 9"/>
+            <wp:docPr id="10" name="Picture 10"/>
             <wp:cNvGraphicFramePr>
               <a:graphicFrameLocks noChangeAspect="1"/>
             </wp:cNvGraphicFramePr>
@@ -1976,7 +2028,7 @@
                     <pic:cNvPicPr/>
                   </pic:nvPicPr>
                   <pic:blipFill>
-                    <a:blip r:embed="rId17"/>
+                    <a:blip r:embed="rId18"/>
                     <a:stretch>
                       <a:fillRect/>
                     </a:stretch>
@@ -2298,7 +2350,7 @@
         <w:drawing>
           <wp:inline xmlns:a="http://schemas.openxmlformats.org/drawingml/2006/main" xmlns:pic="http://schemas.openxmlformats.org/drawingml/2006/picture">
             <wp:extent cx="5760720" cy="2991374"/>
-            <wp:docPr id="10" name="Picture 10"/>
+            <wp:docPr id="11" name="Picture 11"/>
             <wp:cNvGraphicFramePr>
               <a:graphicFrameLocks noChangeAspect="1"/>
             </wp:cNvGraphicFramePr>
@@ -2310,7 +2362,7 @@
                     <pic:cNvPicPr/>
                   </pic:nvPicPr>
                   <pic:blipFill>
-                    <a:blip r:embed="rId18"/>
+                    <a:blip r:embed="rId19"/>
                     <a:stretch>
                       <a:fillRect/>
                     </a:stretch>
@@ -2350,7 +2402,7 @@
         <w:drawing>
           <wp:inline xmlns:a="http://schemas.openxmlformats.org/drawingml/2006/main" xmlns:pic="http://schemas.openxmlformats.org/drawingml/2006/picture">
             <wp:extent cx="5760720" cy="5390041"/>
-            <wp:docPr id="11" name="Picture 11"/>
+            <wp:docPr id="12" name="Picture 12"/>
             <wp:cNvGraphicFramePr>
               <a:graphicFrameLocks noChangeAspect="1"/>
             </wp:cNvGraphicFramePr>
@@ -2362,7 +2414,7 @@
                     <pic:cNvPicPr/>
                   </pic:nvPicPr>
                   <pic:blipFill>
-                    <a:blip r:embed="rId19"/>
+                    <a:blip r:embed="rId20"/>
                     <a:stretch>
                       <a:fillRect/>
                     </a:stretch>

</xml_diff>

<commit_message>
Add team assignments and sprint schedule
Assigns the nine backlog stories across the five team members and fills
the sprint tracker with a six-sprint schedule ending on the submission
deadline (03 Oct 2026).

Co-Authored-By: Claude <noreply@anthropic.com>
</commit_message>
<xml_diff>
--- a/Customer Support Ticket Priority Prediction - Project Documentation.docx
+++ b/Customer Support Ticket Priority Prediction - Project Documentation.docx
@@ -1931,7 +1931,7 @@
           </w:tcPr>
           <w:p>
             <w:r>
-              <w:t>Member 1</w:t>
+              <w:t>Premkumar P</w:t>
             </w:r>
           </w:p>
         </w:tc>
@@ -2003,7 +2003,7 @@
           </w:tcPr>
           <w:p>
             <w:r>
-              <w:t>Member 2</w:t>
+              <w:t>Bharath Kumar P</w:t>
             </w:r>
           </w:p>
         </w:tc>
@@ -2075,7 +2075,7 @@
           </w:tcPr>
           <w:p>
             <w:r>
-              <w:t>Member 3</w:t>
+              <w:t>Vikash V</w:t>
             </w:r>
           </w:p>
         </w:tc>
@@ -2147,7 +2147,7 @@
           </w:tcPr>
           <w:p>
             <w:r>
-              <w:t>Member 4</w:t>
+              <w:t>Pugazhendhi P</w:t>
             </w:r>
           </w:p>
         </w:tc>
@@ -2219,7 +2219,7 @@
           </w:tcPr>
           <w:p>
             <w:r>
-              <w:t>Member 4</w:t>
+              <w:t>Aswin M</w:t>
             </w:r>
           </w:p>
         </w:tc>
@@ -2291,7 +2291,7 @@
           </w:tcPr>
           <w:p>
             <w:r>
-              <w:t>Member 1</w:t>
+              <w:t>Premkumar P</w:t>
             </w:r>
           </w:p>
         </w:tc>
@@ -2363,7 +2363,7 @@
           </w:tcPr>
           <w:p>
             <w:r>
-              <w:t>Member 2</w:t>
+              <w:t>Bharath Kumar P</w:t>
             </w:r>
           </w:p>
         </w:tc>
@@ -2435,7 +2435,7 @@
           </w:tcPr>
           <w:p>
             <w:r>
-              <w:t>Member 3</w:t>
+              <w:t>Vikash V</w:t>
             </w:r>
           </w:p>
         </w:tc>
@@ -2507,7 +2507,7 @@
           </w:tcPr>
           <w:p>
             <w:r>
-              <w:t>Member 4</w:t>
+              <w:t>Pugazhendhi P</w:t>
             </w:r>
           </w:p>
         </w:tc>
@@ -2612,7 +2612,7 @@
           </w:tcPr>
           <w:p>
             <w:r>
-              <w:t>20</w:t>
+              <w:t>3</w:t>
             </w:r>
           </w:p>
         </w:tc>
@@ -2622,7 +2622,7 @@
           </w:tcPr>
           <w:p>
             <w:r>
-              <w:t>6 Days</w:t>
+              <w:t>4 Days</w:t>
             </w:r>
           </w:p>
         </w:tc>
@@ -2632,7 +2632,7 @@
           </w:tcPr>
           <w:p>
             <w:r>
-              <w:t>TBD</w:t>
+              <w:t>14 Sep 2026</w:t>
             </w:r>
           </w:p>
         </w:tc>
@@ -2642,7 +2642,7 @@
           </w:tcPr>
           <w:p>
             <w:r>
-              <w:t>TBD</w:t>
+              <w:t>17 Sep 2026</w:t>
             </w:r>
           </w:p>
         </w:tc>
@@ -2651,7 +2651,9 @@
             <w:tcW w:type="dxa" w:w="1440"/>
           </w:tcPr>
           <w:p>
-            <w:r/>
+            <w:r>
+              <w:t>3</w:t>
+            </w:r>
           </w:p>
         </w:tc>
       </w:tr>
@@ -2672,7 +2674,7 @@
           </w:tcPr>
           <w:p>
             <w:r>
-              <w:t>20</w:t>
+              <w:t>8</w:t>
             </w:r>
           </w:p>
         </w:tc>
@@ -2682,7 +2684,7 @@
           </w:tcPr>
           <w:p>
             <w:r>
-              <w:t>6 Days</w:t>
+              <w:t>5 Days</w:t>
             </w:r>
           </w:p>
         </w:tc>
@@ -2692,7 +2694,7 @@
           </w:tcPr>
           <w:p>
             <w:r>
-              <w:t>TBD</w:t>
+              <w:t>18 Sep 2026</w:t>
             </w:r>
           </w:p>
         </w:tc>
@@ -2702,7 +2704,7 @@
           </w:tcPr>
           <w:p>
             <w:r>
-              <w:t>TBD</w:t>
+              <w:t>22 Sep 2026</w:t>
             </w:r>
           </w:p>
         </w:tc>
@@ -2711,7 +2713,9 @@
             <w:tcW w:type="dxa" w:w="1440"/>
           </w:tcPr>
           <w:p>
-            <w:r/>
+            <w:r>
+              <w:t>8</w:t>
+            </w:r>
           </w:p>
         </w:tc>
       </w:tr>
@@ -2732,7 +2736,7 @@
           </w:tcPr>
           <w:p>
             <w:r>
-              <w:t>20</w:t>
+              <w:t>10</w:t>
             </w:r>
           </w:p>
         </w:tc>
@@ -2742,7 +2746,7 @@
           </w:tcPr>
           <w:p>
             <w:r>
-              <w:t>6 Days</w:t>
+              <w:t>5 Days</w:t>
             </w:r>
           </w:p>
         </w:tc>
@@ -2752,7 +2756,7 @@
           </w:tcPr>
           <w:p>
             <w:r>
-              <w:t>TBD</w:t>
+              <w:t>23 Sep 2026</w:t>
             </w:r>
           </w:p>
         </w:tc>
@@ -2762,7 +2766,7 @@
           </w:tcPr>
           <w:p>
             <w:r>
-              <w:t>TBD</w:t>
+              <w:t>27 Sep 2026</w:t>
             </w:r>
           </w:p>
         </w:tc>
@@ -2771,7 +2775,9 @@
             <w:tcW w:type="dxa" w:w="1440"/>
           </w:tcPr>
           <w:p>
-            <w:r/>
+            <w:r>
+              <w:t>10</w:t>
+            </w:r>
           </w:p>
         </w:tc>
       </w:tr>
@@ -2792,7 +2798,7 @@
           </w:tcPr>
           <w:p>
             <w:r>
-              <w:t>20</w:t>
+              <w:t>13</w:t>
             </w:r>
           </w:p>
         </w:tc>
@@ -2802,7 +2808,7 @@
           </w:tcPr>
           <w:p>
             <w:r>
-              <w:t>6 Days</w:t>
+              <w:t>3 Days</w:t>
             </w:r>
           </w:p>
         </w:tc>
@@ -2812,7 +2818,7 @@
           </w:tcPr>
           <w:p>
             <w:r>
-              <w:t>TBD</w:t>
+              <w:t>28 Sep 2026</w:t>
             </w:r>
           </w:p>
         </w:tc>
@@ -2822,7 +2828,7 @@
           </w:tcPr>
           <w:p>
             <w:r>
-              <w:t>TBD</w:t>
+              <w:t>30 Sep 2026</w:t>
             </w:r>
           </w:p>
         </w:tc>
@@ -2831,7 +2837,9 @@
             <w:tcW w:type="dxa" w:w="1440"/>
           </w:tcPr>
           <w:p>
-            <w:r/>
+            <w:r>
+              <w:t>13</w:t>
+            </w:r>
           </w:p>
         </w:tc>
       </w:tr>
@@ -2862,7 +2870,7 @@
           </w:tcPr>
           <w:p>
             <w:r>
-              <w:t>6 Days</w:t>
+              <w:t>1 Day</w:t>
             </w:r>
           </w:p>
         </w:tc>
@@ -2872,7 +2880,7 @@
           </w:tcPr>
           <w:p>
             <w:r>
-              <w:t>TBD</w:t>
+              <w:t>01 Oct 2026</w:t>
             </w:r>
           </w:p>
         </w:tc>
@@ -2882,7 +2890,7 @@
           </w:tcPr>
           <w:p>
             <w:r>
-              <w:t>TBD</w:t>
+              <w:t>01 Oct 2026</w:t>
             </w:r>
           </w:p>
         </w:tc>
@@ -2891,7 +2899,9 @@
             <w:tcW w:type="dxa" w:w="1440"/>
           </w:tcPr>
           <w:p>
-            <w:r/>
+            <w:r>
+              <w:t>5</w:t>
+            </w:r>
           </w:p>
         </w:tc>
       </w:tr>
@@ -2922,7 +2932,7 @@
           </w:tcPr>
           <w:p>
             <w:r>
-              <w:t>6 Days</w:t>
+              <w:t>2 Days</w:t>
             </w:r>
           </w:p>
         </w:tc>
@@ -2932,7 +2942,7 @@
           </w:tcPr>
           <w:p>
             <w:r>
-              <w:t>TBD</w:t>
+              <w:t>02 Oct 2026</w:t>
             </w:r>
           </w:p>
         </w:tc>
@@ -2942,7 +2952,7 @@
           </w:tcPr>
           <w:p>
             <w:r>
-              <w:t>TBD</w:t>
+              <w:t>03 Oct 2026</w:t>
             </w:r>
           </w:p>
         </w:tc>
@@ -2951,7 +2961,9 @@
             <w:tcW w:type="dxa" w:w="1440"/>
           </w:tcPr>
           <w:p>
-            <w:r/>
+            <w:r>
+              <w:t>5</w:t>
+            </w:r>
           </w:p>
         </w:tc>
       </w:tr>

</xml_diff>

<commit_message>
Add team details, college, and work distribution to project documentation
</commit_message>
<xml_diff>
--- a/Customer Support Ticket Priority Prediction - Project Documentation.docx
+++ b/Customer Support Ticket Priority Prediction - Project Documentation.docx
@@ -2,6 +2,647 @@
 <file path=word/document.xml><?xml version="1.0" encoding="utf-8"?>
 <w:document xmlns:wpc="http://schemas.microsoft.com/office/word/2010/wordprocessingCanvas" xmlns:mo="http://schemas.microsoft.com/office/mac/office/2008/main" xmlns:mc="http://schemas.openxmlformats.org/markup-compatibility/2006" xmlns:mv="urn:schemas-microsoft-com:mac:vml" xmlns:o="urn:schemas-microsoft-com:office:office" xmlns:r="http://schemas.openxmlformats.org/officeDocument/2006/relationships" xmlns:m="http://schemas.openxmlformats.org/officeDocument/2006/math" xmlns:v="urn:schemas-microsoft-com:vml" xmlns:wp14="http://schemas.microsoft.com/office/word/2010/wordprocessingDrawing" xmlns:wp="http://schemas.openxmlformats.org/drawingml/2006/wordprocessingDrawing" xmlns:w10="urn:schemas-microsoft-com:office:word" xmlns:w="http://schemas.openxmlformats.org/wordprocessingml/2006/main" xmlns:w14="http://schemas.microsoft.com/office/word/2010/wordml" xmlns:wpg="http://schemas.microsoft.com/office/word/2010/wordprocessingGroup" xmlns:wpi="http://schemas.microsoft.com/office/word/2010/wordprocessingInk" xmlns:wne="http://schemas.microsoft.com/office/word/2006/wordml" xmlns:wps="http://schemas.microsoft.com/office/word/2010/wordprocessingShape" mc:Ignorable="w14 wp14">
   <w:body>
+    <w:p>
+      <w:pPr>
+        <w:spacing w:before="160" w:after="80"/>
+        <w:jc w:val="center"/>
+      </w:pPr>
+      <w:r>
+        <w:rPr>
+          <w:b/>
+          <w:color w:val="003366"/>
+          <w:sz w:val="34"/>
+        </w:rPr>
+        <w:t>CUSTOMER SUPPORT TICKET PRIORITY PREDICTION AND AUTOMATED ASSIGNMENT SYSTEM USING AGENTFORCE</w:t>
+      </w:r>
+    </w:p>
+    <w:p>
+      <w:pPr>
+        <w:spacing w:after="60"/>
+        <w:jc w:val="center"/>
+      </w:pPr>
+      <w:r>
+        <w:rPr>
+          <w:i/>
+          <w:color w:val="555555"/>
+          <w:sz w:val="23"/>
+        </w:rPr>
+        <w:t>Salesforce-Based Support Ticket Intelligence and Conversational AI Automation</w:t>
+      </w:r>
+    </w:p>
+    <w:p>
+      <w:pPr>
+        <w:spacing w:after="40"/>
+        <w:jc w:val="center"/>
+      </w:pPr>
+      <w:r>
+        <w:rPr>
+          <w:b/>
+          <w:sz w:val="22"/>
+        </w:rPr>
+        <w:t>PROJECT DOCUMENTATION</w:t>
+      </w:r>
+    </w:p>
+    <w:p>
+      <w:pPr>
+        <w:spacing w:after="240"/>
+        <w:jc w:val="center"/>
+      </w:pPr>
+      <w:r>
+        <w:rPr>
+          <w:color w:val="666666"/>
+          <w:sz w:val="19"/>
+        </w:rPr>
+        <w:t>Detailed implementation, configuration, flow automation, Agentforce integration, testing, and team work distribution report.</w:t>
+      </w:r>
+    </w:p>
+    <w:p>
+      <w:pPr>
+        <w:spacing w:after="240"/>
+        <w:jc w:val="center"/>
+      </w:pPr>
+      <w:r>
+        <w:rPr>
+          <w:b/>
+          <w:sz w:val="24"/>
+        </w:rPr>
+        <w:t xml:space="preserve">COLLEGE: </w:t>
+      </w:r>
+      <w:r>
+        <w:rPr>
+          <w:b/>
+          <w:color w:val="003366"/>
+          <w:sz w:val="24"/>
+        </w:rPr>
+        <w:t>GOVERNMENT COLLEGE OF ENGINEERING, ERODE</w:t>
+      </w:r>
+    </w:p>
+    <w:p>
+      <w:pPr>
+        <w:spacing w:after="200"/>
+        <w:jc w:val="left"/>
+      </w:pPr>
+      <w:r>
+        <w:rPr>
+          <w:b/>
+          <w:sz w:val="22"/>
+        </w:rPr>
+        <w:t xml:space="preserve">TEAM LEADER: </w:t>
+      </w:r>
+      <w:r>
+        <w:rPr>
+          <w:sz w:val="22"/>
+        </w:rPr>
+        <w:t>PREMKUMAR P</w:t>
+        <w:br/>
+      </w:r>
+      <w:r>
+        <w:rPr>
+          <w:b/>
+          <w:sz w:val="22"/>
+        </w:rPr>
+        <w:t>TEAM MEMBERS:</w:t>
+        <w:br/>
+      </w:r>
+      <w:r>
+        <w:tab/>
+        <w:tab/>
+        <w:tab/>
+        <w:tab/>
+        <w:t>• BHARATH KUMAR P</w:t>
+        <w:br/>
+      </w:r>
+      <w:r>
+        <w:tab/>
+        <w:tab/>
+        <w:tab/>
+        <w:tab/>
+        <w:t>• VIKASH V</w:t>
+        <w:br/>
+      </w:r>
+      <w:r>
+        <w:tab/>
+        <w:tab/>
+        <w:tab/>
+        <w:tab/>
+        <w:t>• PUGAZHENDHI P</w:t>
+        <w:br/>
+      </w:r>
+      <w:r>
+        <w:tab/>
+        <w:tab/>
+        <w:tab/>
+        <w:tab/>
+        <w:t>• ASWIN M</w:t>
+        <w:br/>
+      </w:r>
+    </w:p>
+    <w:p>
+      <w:pPr>
+        <w:spacing w:after="80"/>
+      </w:pPr>
+      <w:r>
+        <w:rPr>
+          <w:b/>
+          <w:sz w:val="21"/>
+        </w:rPr>
+        <w:t>TEAM WORK DISTRIBUTION SUMMARY:</w:t>
+      </w:r>
+    </w:p>
+    <w:tbl>
+      <w:tblPr>
+        <w:tblStyle w:val="LightGrid-Accent1"/>
+        <w:tblW w:type="auto" w:w="0"/>
+        <w:tblLook w:firstColumn="1" w:firstRow="1" w:lastColumn="0" w:lastRow="0" w:noHBand="0" w:noVBand="1" w:val="04A0"/>
+      </w:tblPr>
+      <w:tblGrid>
+        <w:gridCol w:w="1728"/>
+        <w:gridCol w:w="1728"/>
+        <w:gridCol w:w="1728"/>
+        <w:gridCol w:w="1728"/>
+        <w:gridCol w:w="1728"/>
+      </w:tblGrid>
+      <w:tr>
+        <w:tc>
+          <w:tcPr>
+            <w:tcW w:type="dxa" w:w="1728"/>
+          </w:tcPr>
+          <w:p>
+            <w:r>
+              <w:rPr>
+                <w:b/>
+                <w:sz w:val="18"/>
+              </w:rPr>
+              <w:t>S.No.</w:t>
+            </w:r>
+          </w:p>
+        </w:tc>
+        <w:tc>
+          <w:tcPr>
+            <w:tcW w:type="dxa" w:w="1728"/>
+          </w:tcPr>
+          <w:p>
+            <w:r>
+              <w:rPr>
+                <w:b/>
+                <w:sz w:val="18"/>
+              </w:rPr>
+              <w:t>Team Member</w:t>
+            </w:r>
+          </w:p>
+        </w:tc>
+        <w:tc>
+          <w:tcPr>
+            <w:tcW w:type="dxa" w:w="1728"/>
+          </w:tcPr>
+          <w:p>
+            <w:r>
+              <w:rPr>
+                <w:b/>
+                <w:sz w:val="18"/>
+              </w:rPr>
+              <w:t>Project Role</w:t>
+            </w:r>
+          </w:p>
+        </w:tc>
+        <w:tc>
+          <w:tcPr>
+            <w:tcW w:type="dxa" w:w="1728"/>
+          </w:tcPr>
+          <w:p>
+            <w:r>
+              <w:rPr>
+                <w:b/>
+                <w:sz w:val="18"/>
+              </w:rPr>
+              <w:t>Key Modules / User Stories</w:t>
+            </w:r>
+          </w:p>
+        </w:tc>
+        <w:tc>
+          <w:tcPr>
+            <w:tcW w:type="dxa" w:w="1728"/>
+          </w:tcPr>
+          <w:p>
+            <w:r>
+              <w:rPr>
+                <w:b/>
+                <w:sz w:val="18"/>
+              </w:rPr>
+              <w:t>Story Points</w:t>
+            </w:r>
+          </w:p>
+        </w:tc>
+      </w:tr>
+      <w:tr>
+        <w:tc>
+          <w:tcPr>
+            <w:tcW w:type="dxa" w:w="1728"/>
+          </w:tcPr>
+          <w:p>
+            <w:r>
+              <w:rPr>
+                <w:sz w:val="18"/>
+              </w:rPr>
+              <w:t>1</w:t>
+            </w:r>
+          </w:p>
+        </w:tc>
+        <w:tc>
+          <w:tcPr>
+            <w:tcW w:type="dxa" w:w="1728"/>
+          </w:tcPr>
+          <w:p>
+            <w:r>
+              <w:rPr>
+                <w:sz w:val="18"/>
+              </w:rPr>
+              <w:t>Premkumar P (Team leader)</w:t>
+            </w:r>
+          </w:p>
+        </w:tc>
+        <w:tc>
+          <w:tcPr>
+            <w:tcW w:type="dxa" w:w="1728"/>
+          </w:tcPr>
+          <w:p>
+            <w:r>
+              <w:rPr>
+                <w:sz w:val="18"/>
+              </w:rPr>
+              <w:t>AI &amp; Backend Systems Lead</w:t>
+            </w:r>
+          </w:p>
+        </w:tc>
+        <w:tc>
+          <w:tcPr>
+            <w:tcW w:type="dxa" w:w="1728"/>
+          </w:tcPr>
+          <w:p>
+            <w:r>
+              <w:rPr>
+                <w:sz w:val="18"/>
+              </w:rPr>
+              <w:t>Dev Setup, Agentforce Subagent &amp; Action Mapping (USN-1, USN-6)</w:t>
+            </w:r>
+          </w:p>
+        </w:tc>
+        <w:tc>
+          <w:tcPr>
+            <w:tcW w:type="dxa" w:w="1728"/>
+          </w:tcPr>
+          <w:p>
+            <w:r>
+              <w:rPr>
+                <w:sz w:val="18"/>
+              </w:rPr>
+              <w:t>11</w:t>
+            </w:r>
+          </w:p>
+        </w:tc>
+      </w:tr>
+      <w:tr>
+        <w:tc>
+          <w:tcPr>
+            <w:tcW w:type="dxa" w:w="1728"/>
+          </w:tcPr>
+          <w:p>
+            <w:r>
+              <w:rPr>
+                <w:sz w:val="18"/>
+              </w:rPr>
+              <w:t>2</w:t>
+            </w:r>
+          </w:p>
+        </w:tc>
+        <w:tc>
+          <w:tcPr>
+            <w:tcW w:type="dxa" w:w="1728"/>
+          </w:tcPr>
+          <w:p>
+            <w:r>
+              <w:rPr>
+                <w:sz w:val="18"/>
+              </w:rPr>
+              <w:t>Bharath Kumar P</w:t>
+            </w:r>
+          </w:p>
+        </w:tc>
+        <w:tc>
+          <w:tcPr>
+            <w:tcW w:type="dxa" w:w="1728"/>
+          </w:tcPr>
+          <w:p>
+            <w:r>
+              <w:rPr>
+                <w:sz w:val="18"/>
+              </w:rPr>
+              <w:t>Data Architect &amp; Admin</w:t>
+            </w:r>
+          </w:p>
+        </w:tc>
+        <w:tc>
+          <w:tcPr>
+            <w:tcW w:type="dxa" w:w="1728"/>
+          </w:tcPr>
+          <w:p>
+            <w:r>
+              <w:rPr>
+                <w:sz w:val="18"/>
+              </w:rPr>
+              <w:t>Custom Object &amp; Fields, Urgent Task Automation &amp; Assignment (USN-2, USN-7)</w:t>
+            </w:r>
+          </w:p>
+        </w:tc>
+        <w:tc>
+          <w:tcPr>
+            <w:tcW w:type="dxa" w:w="1728"/>
+          </w:tcPr>
+          <w:p>
+            <w:r>
+              <w:rPr>
+                <w:sz w:val="18"/>
+              </w:rPr>
+              <w:t>10</w:t>
+            </w:r>
+          </w:p>
+        </w:tc>
+      </w:tr>
+      <w:tr>
+        <w:tc>
+          <w:tcPr>
+            <w:tcW w:type="dxa" w:w="1728"/>
+          </w:tcPr>
+          <w:p>
+            <w:r>
+              <w:rPr>
+                <w:sz w:val="18"/>
+              </w:rPr>
+              <w:t>3</w:t>
+            </w:r>
+          </w:p>
+        </w:tc>
+        <w:tc>
+          <w:tcPr>
+            <w:tcW w:type="dxa" w:w="1728"/>
+          </w:tcPr>
+          <w:p>
+            <w:r>
+              <w:rPr>
+                <w:sz w:val="18"/>
+              </w:rPr>
+              <w:t>Vikash V</w:t>
+            </w:r>
+          </w:p>
+        </w:tc>
+        <w:tc>
+          <w:tcPr>
+            <w:tcW w:type="dxa" w:w="1728"/>
+          </w:tcPr>
+          <w:p>
+            <w:r>
+              <w:rPr>
+                <w:sz w:val="18"/>
+              </w:rPr>
+              <w:t>Full-Stack Developer &amp; QA Lead</w:t>
+            </w:r>
+          </w:p>
+        </w:tc>
+        <w:tc>
+          <w:tcPr>
+            <w:tcW w:type="dxa" w:w="1728"/>
+          </w:tcPr>
+          <w:p>
+            <w:r>
+              <w:rPr>
+                <w:sz w:val="18"/>
+              </w:rPr>
+              <w:t>Relationships, UI Layouts &amp; List Views, SLA Risk Logic (USN-3, USN-8)</w:t>
+            </w:r>
+          </w:p>
+        </w:tc>
+        <w:tc>
+          <w:tcPr>
+            <w:tcW w:type="dxa" w:w="1728"/>
+          </w:tcPr>
+          <w:p>
+            <w:r>
+              <w:rPr>
+                <w:sz w:val="18"/>
+              </w:rPr>
+              <w:t>8</w:t>
+            </w:r>
+          </w:p>
+        </w:tc>
+      </w:tr>
+      <w:tr>
+        <w:tc>
+          <w:tcPr>
+            <w:tcW w:type="dxa" w:w="1728"/>
+          </w:tcPr>
+          <w:p>
+            <w:r>
+              <w:rPr>
+                <w:sz w:val="18"/>
+              </w:rPr>
+              <w:t>4</w:t>
+            </w:r>
+          </w:p>
+        </w:tc>
+        <w:tc>
+          <w:tcPr>
+            <w:tcW w:type="dxa" w:w="1728"/>
+          </w:tcPr>
+          <w:p>
+            <w:r>
+              <w:rPr>
+                <w:sz w:val="18"/>
+              </w:rPr>
+              <w:t>Pugazhendhi P</w:t>
+            </w:r>
+          </w:p>
+        </w:tc>
+        <w:tc>
+          <w:tcPr>
+            <w:tcW w:type="dxa" w:w="1728"/>
+          </w:tcPr>
+          <w:p>
+            <w:r>
+              <w:rPr>
+                <w:sz w:val="18"/>
+              </w:rPr>
+              <w:t>Flow Automation Engineer</w:t>
+            </w:r>
+          </w:p>
+        </w:tc>
+        <w:tc>
+          <w:tcPr>
+            <w:tcW w:type="dxa" w:w="1728"/>
+          </w:tcPr>
+          <w:p>
+            <w:r>
+              <w:rPr>
+                <w:sz w:val="18"/>
+              </w:rPr>
+              <w:t>Auto-Launched Flow Architecture, Ticket Retrieval, Messaging (USN-4, USN-9)</w:t>
+            </w:r>
+          </w:p>
+        </w:tc>
+        <w:tc>
+          <w:tcPr>
+            <w:tcW w:type="dxa" w:w="1728"/>
+          </w:tcPr>
+          <w:p>
+            <w:r>
+              <w:rPr>
+                <w:sz w:val="18"/>
+              </w:rPr>
+              <w:t>10</w:t>
+            </w:r>
+          </w:p>
+        </w:tc>
+      </w:tr>
+      <w:tr>
+        <w:tc>
+          <w:tcPr>
+            <w:tcW w:type="dxa" w:w="1728"/>
+          </w:tcPr>
+          <w:p>
+            <w:r>
+              <w:rPr>
+                <w:sz w:val="18"/>
+              </w:rPr>
+              <w:t>5</w:t>
+            </w:r>
+          </w:p>
+        </w:tc>
+        <w:tc>
+          <w:tcPr>
+            <w:tcW w:type="dxa" w:w="1728"/>
+          </w:tcPr>
+          <w:p>
+            <w:r>
+              <w:rPr>
+                <w:sz w:val="18"/>
+              </w:rPr>
+              <w:t>Aswin M</w:t>
+            </w:r>
+          </w:p>
+        </w:tc>
+        <w:tc>
+          <w:tcPr>
+            <w:tcW w:type="dxa" w:w="1728"/>
+          </w:tcPr>
+          <w:p>
+            <w:r>
+              <w:rPr>
+                <w:sz w:val="18"/>
+              </w:rPr>
+              <w:t>Business Logic &amp; Testing Analyst</w:t>
+            </w:r>
+          </w:p>
+        </w:tc>
+        <w:tc>
+          <w:tcPr>
+            <w:tcW w:type="dxa" w:w="1728"/>
+          </w:tcPr>
+          <w:p>
+            <w:r>
+              <w:rPr>
+                <w:sz w:val="18"/>
+              </w:rPr>
+              <w:t>Priority Decision Logic, Test Dataset &amp; Functional Validation (USN-5)</w:t>
+            </w:r>
+          </w:p>
+        </w:tc>
+        <w:tc>
+          <w:tcPr>
+            <w:tcW w:type="dxa" w:w="1728"/>
+          </w:tcPr>
+          <w:p>
+            <w:r>
+              <w:rPr>
+                <w:sz w:val="18"/>
+              </w:rPr>
+              <w:t>5</w:t>
+            </w:r>
+          </w:p>
+        </w:tc>
+      </w:tr>
+      <w:tr>
+        <w:tc>
+          <w:tcPr>
+            <w:tcW w:type="dxa" w:w="1728"/>
+          </w:tcPr>
+          <w:p>
+            <w:r>
+              <w:rPr>
+                <w:sz w:val="18"/>
+              </w:rPr>
+              <w:t>Total</w:t>
+            </w:r>
+          </w:p>
+        </w:tc>
+        <w:tc>
+          <w:tcPr>
+            <w:tcW w:type="dxa" w:w="1728"/>
+          </w:tcPr>
+          <w:p>
+            <w:r>
+              <w:rPr>
+                <w:sz w:val="18"/>
+              </w:rPr>
+              <w:t>5 Members</w:t>
+            </w:r>
+          </w:p>
+        </w:tc>
+        <w:tc>
+          <w:tcPr>
+            <w:tcW w:type="dxa" w:w="1728"/>
+          </w:tcPr>
+          <w:p>
+            <w:r>
+              <w:rPr>
+                <w:sz w:val="18"/>
+              </w:rPr>
+              <w:t>Full Project Lifecycle Delivery</w:t>
+            </w:r>
+          </w:p>
+        </w:tc>
+        <w:tc>
+          <w:tcPr>
+            <w:tcW w:type="dxa" w:w="1728"/>
+          </w:tcPr>
+          <w:p>
+            <w:r>
+              <w:rPr>
+                <w:sz w:val="18"/>
+              </w:rPr>
+              <w:t>9 Backlog User Stories, Flow &amp; Agentforce Testing</w:t>
+            </w:r>
+          </w:p>
+        </w:tc>
+        <w:tc>
+          <w:tcPr>
+            <w:tcW w:type="dxa" w:w="1728"/>
+          </w:tcPr>
+          <w:p>
+            <w:r>
+              <w:rPr>
+                <w:sz w:val="18"/>
+              </w:rPr>
+              <w:t>44</w:t>
+            </w:r>
+          </w:p>
+        </w:tc>
+      </w:tr>
+    </w:tbl>
+    <w:p/>
+    <w:p>
+      <w:r>
+        <w:br w:type="page"/>
+      </w:r>
+    </w:p>
     <w:p>
       <w:pPr>
         <w:pStyle w:val="Title"/>
@@ -1737,7 +2378,7 @@
         <w:pStyle w:val="Heading2"/>
       </w:pPr>
       <w:r>
-        <w:t>5.1 Project Planning</w:t>
+        <w:t>5.1 Project Planning &amp; Work Breakdown Structure</w:t>
       </w:r>
     </w:p>
     <w:p>
@@ -1745,7 +2386,7 @@
         <w:pStyle w:val="ListBullet"/>
       </w:pPr>
       <w:r>
-        <w:t>Agile methodology</w:t>
+        <w:t>Agile Scrum methodology with iterative sprint-based execution</w:t>
       </w:r>
     </w:p>
     <w:p>
@@ -1753,7 +2394,7 @@
         <w:pStyle w:val="ListBullet"/>
       </w:pPr>
       <w:r>
-        <w:t>Epics → Stories → Story Points</w:t>
+        <w:t>Epics decomposed into User Stories and estimated using Story Points</w:t>
       </w:r>
     </w:p>
     <w:p>
@@ -1761,7 +2402,7 @@
         <w:pStyle w:val="ListBullet"/>
       </w:pPr>
       <w:r>
-        <w:t>Sprint-based execution</w:t>
+        <w:t>Velocity tracking used for estimation and sprint capacity planning</w:t>
       </w:r>
     </w:p>
     <w:p>
@@ -1769,12 +2410,1125 @@
         <w:pStyle w:val="ListBullet"/>
       </w:pPr>
       <w:r>
-        <w:t>Velocity calculation used for estimation</w:t>
+        <w:t>Work Package allocation across the 5-member engineering team</w:t>
       </w:r>
     </w:p>
     <w:p>
       <w:r>
-        <w:t>Product Backlog, Sprint Schedule, and Estimation</w:t>
+        <w:t>Work Breakdown Structure (WBS)</w:t>
+      </w:r>
+    </w:p>
+    <w:tbl>
+      <w:tblPr>
+        <w:tblStyle w:val="LightGrid-Accent1"/>
+        <w:tblW w:type="auto" w:w="0"/>
+        <w:tblLook w:firstColumn="1" w:firstRow="1" w:lastColumn="0" w:lastRow="0" w:noHBand="0" w:noVBand="1" w:val="04A0"/>
+      </w:tblPr>
+      <w:tblGrid>
+        <w:gridCol w:w="2160"/>
+        <w:gridCol w:w="2160"/>
+        <w:gridCol w:w="2160"/>
+        <w:gridCol w:w="2160"/>
+      </w:tblGrid>
+      <w:tr>
+        <w:tc>
+          <w:tcPr>
+            <w:tcW w:type="dxa" w:w="2160"/>
+          </w:tcPr>
+          <w:p>
+            <w:r>
+              <w:rPr>
+                <w:b/>
+                <w:sz w:val="18"/>
+              </w:rPr>
+              <w:t>Work Package</w:t>
+            </w:r>
+          </w:p>
+        </w:tc>
+        <w:tc>
+          <w:tcPr>
+            <w:tcW w:type="dxa" w:w="2160"/>
+          </w:tcPr>
+          <w:p>
+            <w:r>
+              <w:rPr>
+                <w:b/>
+                <w:sz w:val="18"/>
+              </w:rPr>
+              <w:t>Tasks / Activities</w:t>
+            </w:r>
+          </w:p>
+        </w:tc>
+        <w:tc>
+          <w:tcPr>
+            <w:tcW w:type="dxa" w:w="2160"/>
+          </w:tcPr>
+          <w:p>
+            <w:r>
+              <w:rPr>
+                <w:b/>
+                <w:sz w:val="18"/>
+              </w:rPr>
+              <w:t>Assigned Member</w:t>
+            </w:r>
+          </w:p>
+        </w:tc>
+        <w:tc>
+          <w:tcPr>
+            <w:tcW w:type="dxa" w:w="2160"/>
+          </w:tcPr>
+          <w:p>
+            <w:r>
+              <w:rPr>
+                <w:b/>
+                <w:sz w:val="18"/>
+              </w:rPr>
+              <w:t>Key Deliverable / Output</w:t>
+            </w:r>
+          </w:p>
+        </w:tc>
+      </w:tr>
+      <w:tr>
+        <w:tc>
+          <w:tcPr>
+            <w:tcW w:type="dxa" w:w="2160"/>
+          </w:tcPr>
+          <w:p>
+            <w:r>
+              <w:rPr>
+                <w:sz w:val="18"/>
+              </w:rPr>
+              <w:t>WP-01</w:t>
+            </w:r>
+          </w:p>
+        </w:tc>
+        <w:tc>
+          <w:tcPr>
+            <w:tcW w:type="dxa" w:w="2160"/>
+          </w:tcPr>
+          <w:p>
+            <w:r>
+              <w:rPr>
+                <w:sz w:val="18"/>
+              </w:rPr>
+              <w:t>Developer Environment Configuration &amp; SFDX Setup</w:t>
+            </w:r>
+          </w:p>
+        </w:tc>
+        <w:tc>
+          <w:tcPr>
+            <w:tcW w:type="dxa" w:w="2160"/>
+          </w:tcPr>
+          <w:p>
+            <w:r>
+              <w:rPr>
+                <w:sz w:val="18"/>
+              </w:rPr>
+              <w:t>Premkumar P</w:t>
+            </w:r>
+          </w:p>
+        </w:tc>
+        <w:tc>
+          <w:tcPr>
+            <w:tcW w:type="dxa" w:w="2160"/>
+          </w:tcPr>
+          <w:p>
+            <w:r>
+              <w:rPr>
+                <w:sz w:val="18"/>
+              </w:rPr>
+              <w:t>Salesforce Developer Org configured with Agentforce enabled</w:t>
+            </w:r>
+          </w:p>
+        </w:tc>
+      </w:tr>
+      <w:tr>
+        <w:tc>
+          <w:tcPr>
+            <w:tcW w:type="dxa" w:w="2160"/>
+          </w:tcPr>
+          <w:p>
+            <w:r>
+              <w:rPr>
+                <w:sz w:val="18"/>
+              </w:rPr>
+              <w:t>WP-02</w:t>
+            </w:r>
+          </w:p>
+        </w:tc>
+        <w:tc>
+          <w:tcPr>
+            <w:tcW w:type="dxa" w:w="2160"/>
+          </w:tcPr>
+          <w:p>
+            <w:r>
+              <w:rPr>
+                <w:sz w:val="18"/>
+              </w:rPr>
+              <w:t>Custom Object &amp; Field Schema Modeling</w:t>
+            </w:r>
+          </w:p>
+        </w:tc>
+        <w:tc>
+          <w:tcPr>
+            <w:tcW w:type="dxa" w:w="2160"/>
+          </w:tcPr>
+          <w:p>
+            <w:r>
+              <w:rPr>
+                <w:sz w:val="18"/>
+              </w:rPr>
+              <w:t>Bharath Kumar P</w:t>
+            </w:r>
+          </w:p>
+        </w:tc>
+        <w:tc>
+          <w:tcPr>
+            <w:tcW w:type="dxa" w:w="2160"/>
+          </w:tcPr>
+          <w:p>
+            <w:r>
+              <w:rPr>
+                <w:sz w:val="18"/>
+              </w:rPr>
+              <w:t>Support_Ticket_Intelligence__c object with 11 custom fields</w:t>
+            </w:r>
+          </w:p>
+        </w:tc>
+      </w:tr>
+      <w:tr>
+        <w:tc>
+          <w:tcPr>
+            <w:tcW w:type="dxa" w:w="2160"/>
+          </w:tcPr>
+          <w:p>
+            <w:r>
+              <w:rPr>
+                <w:sz w:val="18"/>
+              </w:rPr>
+              <w:t>WP-03</w:t>
+            </w:r>
+          </w:p>
+        </w:tc>
+        <w:tc>
+          <w:tcPr>
+            <w:tcW w:type="dxa" w:w="2160"/>
+          </w:tcPr>
+          <w:p>
+            <w:r>
+              <w:rPr>
+                <w:sz w:val="18"/>
+              </w:rPr>
+              <w:t>Relationships, UI Layouts &amp; Navigation</w:t>
+            </w:r>
+          </w:p>
+        </w:tc>
+        <w:tc>
+          <w:tcPr>
+            <w:tcW w:type="dxa" w:w="2160"/>
+          </w:tcPr>
+          <w:p>
+            <w:r>
+              <w:rPr>
+                <w:sz w:val="18"/>
+              </w:rPr>
+              <w:t>Vikash V</w:t>
+            </w:r>
+          </w:p>
+        </w:tc>
+        <w:tc>
+          <w:tcPr>
+            <w:tcW w:type="dxa" w:w="2160"/>
+          </w:tcPr>
+          <w:p>
+            <w:r>
+              <w:rPr>
+                <w:sz w:val="18"/>
+              </w:rPr>
+              <w:t>Account/Contact Lookups, Page Layout &amp; All Tickets list view</w:t>
+            </w:r>
+          </w:p>
+        </w:tc>
+      </w:tr>
+      <w:tr>
+        <w:tc>
+          <w:tcPr>
+            <w:tcW w:type="dxa" w:w="2160"/>
+          </w:tcPr>
+          <w:p>
+            <w:r>
+              <w:rPr>
+                <w:sz w:val="18"/>
+              </w:rPr>
+              <w:t>WP-04</w:t>
+            </w:r>
+          </w:p>
+        </w:tc>
+        <w:tc>
+          <w:tcPr>
+            <w:tcW w:type="dxa" w:w="2160"/>
+          </w:tcPr>
+          <w:p>
+            <w:r>
+              <w:rPr>
+                <w:sz w:val="18"/>
+              </w:rPr>
+              <w:t>Auto-Launched Flow Architecture &amp; Record Retrieval</w:t>
+            </w:r>
+          </w:p>
+        </w:tc>
+        <w:tc>
+          <w:tcPr>
+            <w:tcW w:type="dxa" w:w="2160"/>
+          </w:tcPr>
+          <w:p>
+            <w:r>
+              <w:rPr>
+                <w:sz w:val="18"/>
+              </w:rPr>
+              <w:t>Pugazhendhi P</w:t>
+            </w:r>
+          </w:p>
+        </w:tc>
+        <w:tc>
+          <w:tcPr>
+            <w:tcW w:type="dxa" w:w="2160"/>
+          </w:tcPr>
+          <w:p>
+            <w:r>
+              <w:rPr>
+                <w:sz w:val="18"/>
+              </w:rPr>
+              <w:t>Flow skeleton with Get Records elements for Account &amp; Ticket</w:t>
+            </w:r>
+          </w:p>
+        </w:tc>
+      </w:tr>
+      <w:tr>
+        <w:tc>
+          <w:tcPr>
+            <w:tcW w:type="dxa" w:w="2160"/>
+          </w:tcPr>
+          <w:p>
+            <w:r>
+              <w:rPr>
+                <w:sz w:val="18"/>
+              </w:rPr>
+              <w:t>WP-05</w:t>
+            </w:r>
+          </w:p>
+        </w:tc>
+        <w:tc>
+          <w:tcPr>
+            <w:tcW w:type="dxa" w:w="2160"/>
+          </w:tcPr>
+          <w:p>
+            <w:r>
+              <w:rPr>
+                <w:sz w:val="18"/>
+              </w:rPr>
+              <w:t>Urgency Priority Decision Logic &amp; Status Updates</w:t>
+            </w:r>
+          </w:p>
+        </w:tc>
+        <w:tc>
+          <w:tcPr>
+            <w:tcW w:type="dxa" w:w="2160"/>
+          </w:tcPr>
+          <w:p>
+            <w:r>
+              <w:rPr>
+                <w:sz w:val="18"/>
+              </w:rPr>
+              <w:t>Aswin M</w:t>
+            </w:r>
+          </w:p>
+        </w:tc>
+        <w:tc>
+          <w:tcPr>
+            <w:tcW w:type="dxa" w:w="2160"/>
+          </w:tcPr>
+          <w:p>
+            <w:r>
+              <w:rPr>
+                <w:sz w:val="18"/>
+              </w:rPr>
+              <w:t>Keyword decision rules (urgent/slow/etc.) &amp; priority update back to record</w:t>
+            </w:r>
+          </w:p>
+        </w:tc>
+      </w:tr>
+      <w:tr>
+        <w:tc>
+          <w:tcPr>
+            <w:tcW w:type="dxa" w:w="2160"/>
+          </w:tcPr>
+          <w:p>
+            <w:r>
+              <w:rPr>
+                <w:sz w:val="18"/>
+              </w:rPr>
+              <w:t>WP-06</w:t>
+            </w:r>
+          </w:p>
+        </w:tc>
+        <w:tc>
+          <w:tcPr>
+            <w:tcW w:type="dxa" w:w="2160"/>
+          </w:tcPr>
+          <w:p>
+            <w:r>
+              <w:rPr>
+                <w:sz w:val="18"/>
+              </w:rPr>
+              <w:t>Urgent Task Creation &amp; Senior Agent Assignment</w:t>
+            </w:r>
+          </w:p>
+        </w:tc>
+        <w:tc>
+          <w:tcPr>
+            <w:tcW w:type="dxa" w:w="2160"/>
+          </w:tcPr>
+          <w:p>
+            <w:r>
+              <w:rPr>
+                <w:sz w:val="18"/>
+              </w:rPr>
+              <w:t>Bharath Kumar P</w:t>
+            </w:r>
+          </w:p>
+        </w:tc>
+        <w:tc>
+          <w:tcPr>
+            <w:tcW w:type="dxa" w:w="2160"/>
+          </w:tcPr>
+          <w:p>
+            <w:r>
+              <w:rPr>
+                <w:sz w:val="18"/>
+              </w:rPr>
+              <w:t>High-priority Task creation &amp; Senior Support Agent assignment</w:t>
+            </w:r>
+          </w:p>
+        </w:tc>
+      </w:tr>
+      <w:tr>
+        <w:tc>
+          <w:tcPr>
+            <w:tcW w:type="dxa" w:w="2160"/>
+          </w:tcPr>
+          <w:p>
+            <w:r>
+              <w:rPr>
+                <w:sz w:val="18"/>
+              </w:rPr>
+              <w:t>WP-07</w:t>
+            </w:r>
+          </w:p>
+        </w:tc>
+        <w:tc>
+          <w:tcPr>
+            <w:tcW w:type="dxa" w:w="2160"/>
+          </w:tcPr>
+          <w:p>
+            <w:r>
+              <w:rPr>
+                <w:sz w:val="18"/>
+              </w:rPr>
+              <w:t>SLA Breach Risk Calculation &amp; Management</w:t>
+            </w:r>
+          </w:p>
+        </w:tc>
+        <w:tc>
+          <w:tcPr>
+            <w:tcW w:type="dxa" w:w="2160"/>
+          </w:tcPr>
+          <w:p>
+            <w:r>
+              <w:rPr>
+                <w:sz w:val="18"/>
+              </w:rPr>
+              <w:t>Vikash V</w:t>
+            </w:r>
+          </w:p>
+        </w:tc>
+        <w:tc>
+          <w:tcPr>
+            <w:tcW w:type="dxa" w:w="2160"/>
+          </w:tcPr>
+          <w:p>
+            <w:r>
+              <w:rPr>
+                <w:sz w:val="18"/>
+              </w:rPr>
+              <w:t>Decision rule for tickets &gt; 2 days old &amp; SLA_Breach_Risk__c flag</w:t>
+            </w:r>
+          </w:p>
+        </w:tc>
+      </w:tr>
+      <w:tr>
+        <w:tc>
+          <w:tcPr>
+            <w:tcW w:type="dxa" w:w="2160"/>
+          </w:tcPr>
+          <w:p>
+            <w:r>
+              <w:rPr>
+                <w:sz w:val="18"/>
+              </w:rPr>
+              <w:t>WP-08</w:t>
+            </w:r>
+          </w:p>
+        </w:tc>
+        <w:tc>
+          <w:tcPr>
+            <w:tcW w:type="dxa" w:w="2160"/>
+          </w:tcPr>
+          <w:p>
+            <w:r>
+              <w:rPr>
+                <w:sz w:val="18"/>
+              </w:rPr>
+              <w:t>Agentforce Subagent Creation &amp; Flow Action Registration</w:t>
+            </w:r>
+          </w:p>
+        </w:tc>
+        <w:tc>
+          <w:tcPr>
+            <w:tcW w:type="dxa" w:w="2160"/>
+          </w:tcPr>
+          <w:p>
+            <w:r>
+              <w:rPr>
+                <w:sz w:val="18"/>
+              </w:rPr>
+              <w:t>Premkumar P</w:t>
+            </w:r>
+          </w:p>
+        </w:tc>
+        <w:tc>
+          <w:tcPr>
+            <w:tcW w:type="dxa" w:w="2160"/>
+          </w:tcPr>
+          <w:p>
+            <w:r>
+              <w:rPr>
+                <w:sz w:val="18"/>
+              </w:rPr>
+              <w:t>Support Ticket Priority Analysis subagent &amp; active Flow action</w:t>
+            </w:r>
+          </w:p>
+        </w:tc>
+      </w:tr>
+      <w:tr>
+        <w:tc>
+          <w:tcPr>
+            <w:tcW w:type="dxa" w:w="2160"/>
+          </w:tcPr>
+          <w:p>
+            <w:r>
+              <w:rPr>
+                <w:sz w:val="18"/>
+              </w:rPr>
+              <w:t>WP-09</w:t>
+            </w:r>
+          </w:p>
+        </w:tc>
+        <w:tc>
+          <w:tcPr>
+            <w:tcW w:type="dxa" w:w="2160"/>
+          </w:tcPr>
+          <w:p>
+            <w:r>
+              <w:rPr>
+                <w:sz w:val="18"/>
+              </w:rPr>
+              <w:t>End-to-End Conversational Testing &amp; Verification</w:t>
+            </w:r>
+          </w:p>
+        </w:tc>
+        <w:tc>
+          <w:tcPr>
+            <w:tcW w:type="dxa" w:w="2160"/>
+          </w:tcPr>
+          <w:p>
+            <w:r>
+              <w:rPr>
+                <w:sz w:val="18"/>
+              </w:rPr>
+              <w:t>Pugazhendhi P &amp; Aswin M</w:t>
+            </w:r>
+          </w:p>
+        </w:tc>
+        <w:tc>
+          <w:tcPr>
+            <w:tcW w:type="dxa" w:w="2160"/>
+          </w:tcPr>
+          <w:p>
+            <w:r>
+              <w:rPr>
+                <w:sz w:val="18"/>
+              </w:rPr>
+              <w:t>Multi-branch agent testing, action messaging, and test evidence</w:t>
+            </w:r>
+          </w:p>
+        </w:tc>
+      </w:tr>
+    </w:tbl>
+    <w:p/>
+    <w:p>
+      <w:pPr>
+        <w:pStyle w:val="Heading2"/>
+      </w:pPr>
+      <w:r>
+        <w:t>5.2 Team Work Distribution</w:t>
+      </w:r>
+    </w:p>
+    <w:p>
+      <w:r>
+        <w:t>The project implementation and deliverables were systematically distributed among all 5 students based on technical competencies and project requirements. Each team member owned dedicated modules and backlog stories:</w:t>
+      </w:r>
+    </w:p>
+    <w:p>
+      <w:pPr>
+        <w:pStyle w:val="ListBullet"/>
+      </w:pPr>
+      <w:r>
+        <w:t>Premkumar P (Team leader) — 11 Story Points: Architected the end-to-end solution and led developer setup. Configured the Salesforce environment, activated Agentforce Default, built and configured the 'Support Ticket Priority Analysis' subagent, defined conversational instructions, and registered the Auto-Launched Flow as an Agent Action.</w:t>
+      </w:r>
+    </w:p>
+    <w:p>
+      <w:pPr>
+        <w:pStyle w:val="ListBullet"/>
+      </w:pPr>
+      <w:r>
+        <w:t>Bharath Kumar P — 10 Story Points: Led data architecture and task automation. Implemented the 'Support_Ticket_Intelligence__c' custom object schema and its 11 fields, configured field-level security permissions, built the automated High-priority Task creation element in Flow, and established Senior Support Agent routing.</w:t>
+      </w:r>
+    </w:p>
+    <w:p>
+      <w:pPr>
+        <w:pStyle w:val="ListBullet"/>
+      </w:pPr>
+      <w:r>
+        <w:t>Vikash V — 8 Story Points: Designed data relationships linking tickets to customer Accounts and Contacts, customized page layouts, created the 'All Tickets' list view for full visibility, implemented the SLA breach risk decision logic for tickets older than 2 days, and ensured metadata traceability.</w:t>
+      </w:r>
+    </w:p>
+    <w:p>
+      <w:pPr>
+        <w:pStyle w:val="ListBullet"/>
+      </w:pPr>
+      <w:r>
+        <w:t>Pugazhendhi P — 10 Story Points: Developed the Auto-Launched Flow architecture ('Support_Ticket_Intelligence'), constructed Get Records elements for Account identification and latest ticket retrieval, defined Flow output variables, mapped conversational action messages, and conducted conversational verification.</w:t>
+      </w:r>
+    </w:p>
+    <w:p>
+      <w:pPr>
+        <w:pStyle w:val="ListBullet"/>
+      </w:pPr>
+      <w:r>
+        <w:t>Aswin M — 5 Story Points: Engineered the keyword-based priority classification decision logic (High, Medium, Low branches), formulated keyword criteria ('urgent', 'not working', 'failure', 'slow', 'delay'), created multi-account sample datasets (Acme Corporation, Globex Systems, Initech Solutions), and validated priority assignment accuracy.</w:t>
+      </w:r>
+    </w:p>
+    <w:p>
+      <w:r>
+        <w:t>Team Work Distribution Summary</w:t>
+      </w:r>
+    </w:p>
+    <w:tbl>
+      <w:tblPr>
+        <w:tblStyle w:val="LightGrid-Accent1"/>
+        <w:tblW w:type="auto" w:w="0"/>
+        <w:tblLook w:firstColumn="1" w:firstRow="1" w:lastColumn="0" w:lastRow="0" w:noHBand="0" w:noVBand="1" w:val="04A0"/>
+      </w:tblPr>
+      <w:tblGrid>
+        <w:gridCol w:w="1728"/>
+        <w:gridCol w:w="1728"/>
+        <w:gridCol w:w="1728"/>
+        <w:gridCol w:w="1728"/>
+        <w:gridCol w:w="1728"/>
+      </w:tblGrid>
+      <w:tr>
+        <w:tc>
+          <w:tcPr>
+            <w:tcW w:type="dxa" w:w="1728"/>
+          </w:tcPr>
+          <w:p>
+            <w:r>
+              <w:rPr>
+                <w:b/>
+                <w:sz w:val="18"/>
+              </w:rPr>
+              <w:t>S.No.</w:t>
+            </w:r>
+          </w:p>
+        </w:tc>
+        <w:tc>
+          <w:tcPr>
+            <w:tcW w:type="dxa" w:w="1728"/>
+          </w:tcPr>
+          <w:p>
+            <w:r>
+              <w:rPr>
+                <w:b/>
+                <w:sz w:val="18"/>
+              </w:rPr>
+              <w:t>Team Member</w:t>
+            </w:r>
+          </w:p>
+        </w:tc>
+        <w:tc>
+          <w:tcPr>
+            <w:tcW w:type="dxa" w:w="1728"/>
+          </w:tcPr>
+          <w:p>
+            <w:r>
+              <w:rPr>
+                <w:b/>
+                <w:sz w:val="18"/>
+              </w:rPr>
+              <w:t>Project Role</w:t>
+            </w:r>
+          </w:p>
+        </w:tc>
+        <w:tc>
+          <w:tcPr>
+            <w:tcW w:type="dxa" w:w="1728"/>
+          </w:tcPr>
+          <w:p>
+            <w:r>
+              <w:rPr>
+                <w:b/>
+                <w:sz w:val="18"/>
+              </w:rPr>
+              <w:t>User Stories Handled</w:t>
+            </w:r>
+          </w:p>
+        </w:tc>
+        <w:tc>
+          <w:tcPr>
+            <w:tcW w:type="dxa" w:w="1728"/>
+          </w:tcPr>
+          <w:p>
+            <w:r>
+              <w:rPr>
+                <w:b/>
+                <w:sz w:val="18"/>
+              </w:rPr>
+              <w:t>Story Points</w:t>
+            </w:r>
+          </w:p>
+        </w:tc>
+      </w:tr>
+      <w:tr>
+        <w:tc>
+          <w:tcPr>
+            <w:tcW w:type="dxa" w:w="1728"/>
+          </w:tcPr>
+          <w:p>
+            <w:r>
+              <w:rPr>
+                <w:sz w:val="18"/>
+              </w:rPr>
+              <w:t>1</w:t>
+            </w:r>
+          </w:p>
+        </w:tc>
+        <w:tc>
+          <w:tcPr>
+            <w:tcW w:type="dxa" w:w="1728"/>
+          </w:tcPr>
+          <w:p>
+            <w:r>
+              <w:rPr>
+                <w:sz w:val="18"/>
+              </w:rPr>
+              <w:t>Premkumar P (Team leader)</w:t>
+            </w:r>
+          </w:p>
+        </w:tc>
+        <w:tc>
+          <w:tcPr>
+            <w:tcW w:type="dxa" w:w="1728"/>
+          </w:tcPr>
+          <w:p>
+            <w:r>
+              <w:rPr>
+                <w:sz w:val="18"/>
+              </w:rPr>
+              <w:t>AI &amp; Backend Systems Lead</w:t>
+            </w:r>
+          </w:p>
+        </w:tc>
+        <w:tc>
+          <w:tcPr>
+            <w:tcW w:type="dxa" w:w="1728"/>
+          </w:tcPr>
+          <w:p>
+            <w:r>
+              <w:rPr>
+                <w:sz w:val="18"/>
+              </w:rPr>
+              <w:t>USN-1, USN-6</w:t>
+            </w:r>
+          </w:p>
+        </w:tc>
+        <w:tc>
+          <w:tcPr>
+            <w:tcW w:type="dxa" w:w="1728"/>
+          </w:tcPr>
+          <w:p>
+            <w:r>
+              <w:rPr>
+                <w:sz w:val="18"/>
+              </w:rPr>
+              <w:t>11</w:t>
+            </w:r>
+          </w:p>
+        </w:tc>
+      </w:tr>
+      <w:tr>
+        <w:tc>
+          <w:tcPr>
+            <w:tcW w:type="dxa" w:w="1728"/>
+          </w:tcPr>
+          <w:p>
+            <w:r>
+              <w:rPr>
+                <w:sz w:val="18"/>
+              </w:rPr>
+              <w:t>2</w:t>
+            </w:r>
+          </w:p>
+        </w:tc>
+        <w:tc>
+          <w:tcPr>
+            <w:tcW w:type="dxa" w:w="1728"/>
+          </w:tcPr>
+          <w:p>
+            <w:r>
+              <w:rPr>
+                <w:sz w:val="18"/>
+              </w:rPr>
+              <w:t>Bharath Kumar P</w:t>
+            </w:r>
+          </w:p>
+        </w:tc>
+        <w:tc>
+          <w:tcPr>
+            <w:tcW w:type="dxa" w:w="1728"/>
+          </w:tcPr>
+          <w:p>
+            <w:r>
+              <w:rPr>
+                <w:sz w:val="18"/>
+              </w:rPr>
+              <w:t>Data Architect &amp; Admin</w:t>
+            </w:r>
+          </w:p>
+        </w:tc>
+        <w:tc>
+          <w:tcPr>
+            <w:tcW w:type="dxa" w:w="1728"/>
+          </w:tcPr>
+          <w:p>
+            <w:r>
+              <w:rPr>
+                <w:sz w:val="18"/>
+              </w:rPr>
+              <w:t>USN-2, USN-7</w:t>
+            </w:r>
+          </w:p>
+        </w:tc>
+        <w:tc>
+          <w:tcPr>
+            <w:tcW w:type="dxa" w:w="1728"/>
+          </w:tcPr>
+          <w:p>
+            <w:r>
+              <w:rPr>
+                <w:sz w:val="18"/>
+              </w:rPr>
+              <w:t>10</w:t>
+            </w:r>
+          </w:p>
+        </w:tc>
+      </w:tr>
+      <w:tr>
+        <w:tc>
+          <w:tcPr>
+            <w:tcW w:type="dxa" w:w="1728"/>
+          </w:tcPr>
+          <w:p>
+            <w:r>
+              <w:rPr>
+                <w:sz w:val="18"/>
+              </w:rPr>
+              <w:t>3</w:t>
+            </w:r>
+          </w:p>
+        </w:tc>
+        <w:tc>
+          <w:tcPr>
+            <w:tcW w:type="dxa" w:w="1728"/>
+          </w:tcPr>
+          <w:p>
+            <w:r>
+              <w:rPr>
+                <w:sz w:val="18"/>
+              </w:rPr>
+              <w:t>Vikash V</w:t>
+            </w:r>
+          </w:p>
+        </w:tc>
+        <w:tc>
+          <w:tcPr>
+            <w:tcW w:type="dxa" w:w="1728"/>
+          </w:tcPr>
+          <w:p>
+            <w:r>
+              <w:rPr>
+                <w:sz w:val="18"/>
+              </w:rPr>
+              <w:t>Full-Stack Developer &amp; QA Lead</w:t>
+            </w:r>
+          </w:p>
+        </w:tc>
+        <w:tc>
+          <w:tcPr>
+            <w:tcW w:type="dxa" w:w="1728"/>
+          </w:tcPr>
+          <w:p>
+            <w:r>
+              <w:rPr>
+                <w:sz w:val="18"/>
+              </w:rPr>
+              <w:t>USN-3, USN-8</w:t>
+            </w:r>
+          </w:p>
+        </w:tc>
+        <w:tc>
+          <w:tcPr>
+            <w:tcW w:type="dxa" w:w="1728"/>
+          </w:tcPr>
+          <w:p>
+            <w:r>
+              <w:rPr>
+                <w:sz w:val="18"/>
+              </w:rPr>
+              <w:t>8</w:t>
+            </w:r>
+          </w:p>
+        </w:tc>
+      </w:tr>
+      <w:tr>
+        <w:tc>
+          <w:tcPr>
+            <w:tcW w:type="dxa" w:w="1728"/>
+          </w:tcPr>
+          <w:p>
+            <w:r>
+              <w:rPr>
+                <w:sz w:val="18"/>
+              </w:rPr>
+              <w:t>4</w:t>
+            </w:r>
+          </w:p>
+        </w:tc>
+        <w:tc>
+          <w:tcPr>
+            <w:tcW w:type="dxa" w:w="1728"/>
+          </w:tcPr>
+          <w:p>
+            <w:r>
+              <w:rPr>
+                <w:sz w:val="18"/>
+              </w:rPr>
+              <w:t>Pugazhendhi P</w:t>
+            </w:r>
+          </w:p>
+        </w:tc>
+        <w:tc>
+          <w:tcPr>
+            <w:tcW w:type="dxa" w:w="1728"/>
+          </w:tcPr>
+          <w:p>
+            <w:r>
+              <w:rPr>
+                <w:sz w:val="18"/>
+              </w:rPr>
+              <w:t>Flow Automation Engineer</w:t>
+            </w:r>
+          </w:p>
+        </w:tc>
+        <w:tc>
+          <w:tcPr>
+            <w:tcW w:type="dxa" w:w="1728"/>
+          </w:tcPr>
+          <w:p>
+            <w:r>
+              <w:rPr>
+                <w:sz w:val="18"/>
+              </w:rPr>
+              <w:t>USN-4, USN-9</w:t>
+            </w:r>
+          </w:p>
+        </w:tc>
+        <w:tc>
+          <w:tcPr>
+            <w:tcW w:type="dxa" w:w="1728"/>
+          </w:tcPr>
+          <w:p>
+            <w:r>
+              <w:rPr>
+                <w:sz w:val="18"/>
+              </w:rPr>
+              <w:t>10</w:t>
+            </w:r>
+          </w:p>
+        </w:tc>
+      </w:tr>
+      <w:tr>
+        <w:tc>
+          <w:tcPr>
+            <w:tcW w:type="dxa" w:w="1728"/>
+          </w:tcPr>
+          <w:p>
+            <w:r>
+              <w:rPr>
+                <w:sz w:val="18"/>
+              </w:rPr>
+              <w:t>5</w:t>
+            </w:r>
+          </w:p>
+        </w:tc>
+        <w:tc>
+          <w:tcPr>
+            <w:tcW w:type="dxa" w:w="1728"/>
+          </w:tcPr>
+          <w:p>
+            <w:r>
+              <w:rPr>
+                <w:sz w:val="18"/>
+              </w:rPr>
+              <w:t>Aswin M</w:t>
+            </w:r>
+          </w:p>
+        </w:tc>
+        <w:tc>
+          <w:tcPr>
+            <w:tcW w:type="dxa" w:w="1728"/>
+          </w:tcPr>
+          <w:p>
+            <w:r>
+              <w:rPr>
+                <w:sz w:val="18"/>
+              </w:rPr>
+              <w:t>Business Logic &amp; Testing Analyst</w:t>
+            </w:r>
+          </w:p>
+        </w:tc>
+        <w:tc>
+          <w:tcPr>
+            <w:tcW w:type="dxa" w:w="1728"/>
+          </w:tcPr>
+          <w:p>
+            <w:r>
+              <w:rPr>
+                <w:sz w:val="18"/>
+              </w:rPr>
+              <w:t>USN-5</w:t>
+            </w:r>
+          </w:p>
+        </w:tc>
+        <w:tc>
+          <w:tcPr>
+            <w:tcW w:type="dxa" w:w="1728"/>
+          </w:tcPr>
+          <w:p>
+            <w:r>
+              <w:rPr>
+                <w:sz w:val="18"/>
+              </w:rPr>
+              <w:t>5</w:t>
+            </w:r>
+          </w:p>
+        </w:tc>
+      </w:tr>
+      <w:tr>
+        <w:tc>
+          <w:tcPr>
+            <w:tcW w:type="dxa" w:w="1728"/>
+          </w:tcPr>
+          <w:p>
+            <w:r>
+              <w:rPr>
+                <w:sz w:val="18"/>
+              </w:rPr>
+              <w:t>Total</w:t>
+            </w:r>
+          </w:p>
+        </w:tc>
+        <w:tc>
+          <w:tcPr>
+            <w:tcW w:type="dxa" w:w="1728"/>
+          </w:tcPr>
+          <w:p>
+            <w:r>
+              <w:rPr>
+                <w:sz w:val="18"/>
+              </w:rPr>
+              <w:t>5 Team Members</w:t>
+            </w:r>
+          </w:p>
+        </w:tc>
+        <w:tc>
+          <w:tcPr>
+            <w:tcW w:type="dxa" w:w="1728"/>
+          </w:tcPr>
+          <w:p>
+            <w:r>
+              <w:rPr>
+                <w:sz w:val="18"/>
+              </w:rPr>
+              <w:t>Full Application Lifecycle</w:t>
+            </w:r>
+          </w:p>
+        </w:tc>
+        <w:tc>
+          <w:tcPr>
+            <w:tcW w:type="dxa" w:w="1728"/>
+          </w:tcPr>
+          <w:p>
+            <w:r>
+              <w:rPr>
+                <w:sz w:val="18"/>
+              </w:rPr>
+              <w:t>9 Backlog Stories</w:t>
+            </w:r>
+          </w:p>
+        </w:tc>
+        <w:tc>
+          <w:tcPr>
+            <w:tcW w:type="dxa" w:w="1728"/>
+          </w:tcPr>
+          <w:p>
+            <w:r>
+              <w:rPr>
+                <w:sz w:val="18"/>
+              </w:rPr>
+              <w:t>44</w:t>
+            </w:r>
+          </w:p>
+        </w:tc>
+      </w:tr>
+    </w:tbl>
+    <w:p/>
+    <w:p>
+      <w:pPr>
+        <w:pStyle w:val="Heading2"/>
+      </w:pPr>
+      <w:r>
+        <w:t>5.3 Product Backlog, Sprint Schedule, and Estimation</w:t>
       </w:r>
     </w:p>
     <w:tbl>
@@ -1799,6 +3553,10 @@
           </w:tcPr>
           <w:p>
             <w:r>
+              <w:rPr>
+                <w:b/>
+                <w:sz w:val="18"/>
+              </w:rPr>
               <w:t>Sprint</w:t>
             </w:r>
           </w:p>
@@ -1809,6 +3567,10 @@
           </w:tcPr>
           <w:p>
             <w:r>
+              <w:rPr>
+                <w:b/>
+                <w:sz w:val="18"/>
+              </w:rPr>
               <w:t>Functional Requirement (Epic)</w:t>
             </w:r>
           </w:p>
@@ -1819,6 +3581,10 @@
           </w:tcPr>
           <w:p>
             <w:r>
+              <w:rPr>
+                <w:b/>
+                <w:sz w:val="18"/>
+              </w:rPr>
               <w:t>User Story No.</w:t>
             </w:r>
           </w:p>
@@ -1829,6 +3595,10 @@
           </w:tcPr>
           <w:p>
             <w:r>
+              <w:rPr>
+                <w:b/>
+                <w:sz w:val="18"/>
+              </w:rPr>
               <w:t>User Story / Task</w:t>
             </w:r>
           </w:p>
@@ -1839,6 +3609,10 @@
           </w:tcPr>
           <w:p>
             <w:r>
+              <w:rPr>
+                <w:b/>
+                <w:sz w:val="18"/>
+              </w:rPr>
               <w:t>Story Points</w:t>
             </w:r>
           </w:p>
@@ -1849,6 +3623,10 @@
           </w:tcPr>
           <w:p>
             <w:r>
+              <w:rPr>
+                <w:b/>
+                <w:sz w:val="18"/>
+              </w:rPr>
               <w:t>Priority</w:t>
             </w:r>
           </w:p>
@@ -1859,6 +3637,10 @@
           </w:tcPr>
           <w:p>
             <w:r>
+              <w:rPr>
+                <w:b/>
+                <w:sz w:val="18"/>
+              </w:rPr>
               <w:t>Team Member</w:t>
             </w:r>
           </w:p>
@@ -1871,6 +3653,9 @@
           </w:tcPr>
           <w:p>
             <w:r>
+              <w:rPr>
+                <w:sz w:val="18"/>
+              </w:rPr>
               <w:t>Sprint-1</w:t>
             </w:r>
           </w:p>
@@ -1881,6 +3666,9 @@
           </w:tcPr>
           <w:p>
             <w:r>
+              <w:rPr>
+                <w:sz w:val="18"/>
+              </w:rPr>
               <w:t>Developer Setup</w:t>
             </w:r>
           </w:p>
@@ -1891,6 +3679,9 @@
           </w:tcPr>
           <w:p>
             <w:r>
+              <w:rPr>
+                <w:sz w:val="18"/>
+              </w:rPr>
               <w:t>USN-1</w:t>
             </w:r>
           </w:p>
@@ -1901,6 +3692,9 @@
           </w:tcPr>
           <w:p>
             <w:r>
+              <w:rPr>
+                <w:sz w:val="18"/>
+              </w:rPr>
               <w:t>As a system administrator, I want to configure the Salesforce environment for Support Ticket Intelligence so that the support automation solution can be developed.</w:t>
             </w:r>
           </w:p>
@@ -1911,6 +3705,9 @@
           </w:tcPr>
           <w:p>
             <w:r>
+              <w:rPr>
+                <w:sz w:val="18"/>
+              </w:rPr>
               <w:t>3</w:t>
             </w:r>
           </w:p>
@@ -1921,6 +3718,9 @@
           </w:tcPr>
           <w:p>
             <w:r>
+              <w:rPr>
+                <w:sz w:val="18"/>
+              </w:rPr>
               <w:t>High</w:t>
             </w:r>
           </w:p>
@@ -1931,6 +3731,9 @@
           </w:tcPr>
           <w:p>
             <w:r>
+              <w:rPr>
+                <w:sz w:val="18"/>
+              </w:rPr>
               <w:t>Premkumar P</w:t>
             </w:r>
           </w:p>
@@ -1943,6 +3746,9 @@
           </w:tcPr>
           <w:p>
             <w:r>
+              <w:rPr>
+                <w:sz w:val="18"/>
+              </w:rPr>
               <w:t>Sprint-2</w:t>
             </w:r>
           </w:p>
@@ -1953,6 +3759,9 @@
           </w:tcPr>
           <w:p>
             <w:r>
+              <w:rPr>
+                <w:sz w:val="18"/>
+              </w:rPr>
               <w:t>Data Modeling</w:t>
             </w:r>
           </w:p>
@@ -1963,6 +3772,9 @@
           </w:tcPr>
           <w:p>
             <w:r>
+              <w:rPr>
+                <w:sz w:val="18"/>
+              </w:rPr>
               <w:t>USN-2</w:t>
             </w:r>
           </w:p>
@@ -1973,6 +3785,9 @@
           </w:tcPr>
           <w:p>
             <w:r>
+              <w:rPr>
+                <w:sz w:val="18"/>
+              </w:rPr>
               <w:t>As an admin, I want to create the Support Ticket Intelligence object with required fields and relationships so that customer support ticket information is stored systematically.</w:t>
             </w:r>
           </w:p>
@@ -1983,6 +3798,9 @@
           </w:tcPr>
           <w:p>
             <w:r>
+              <w:rPr>
+                <w:sz w:val="18"/>
+              </w:rPr>
               <w:t>5</w:t>
             </w:r>
           </w:p>
@@ -1993,6 +3811,9 @@
           </w:tcPr>
           <w:p>
             <w:r>
+              <w:rPr>
+                <w:sz w:val="18"/>
+              </w:rPr>
               <w:t>High</w:t>
             </w:r>
           </w:p>
@@ -2003,6 +3824,9 @@
           </w:tcPr>
           <w:p>
             <w:r>
+              <w:rPr>
+                <w:sz w:val="18"/>
+              </w:rPr>
               <w:t>Bharath Kumar P</w:t>
             </w:r>
           </w:p>
@@ -2015,6 +3839,9 @@
           </w:tcPr>
           <w:p>
             <w:r>
+              <w:rPr>
+                <w:sz w:val="18"/>
+              </w:rPr>
               <w:t>Sprint-2</w:t>
             </w:r>
           </w:p>
@@ -2025,6 +3852,9 @@
           </w:tcPr>
           <w:p>
             <w:r>
+              <w:rPr>
+                <w:sz w:val="18"/>
+              </w:rPr>
               <w:t>Data Modeling</w:t>
             </w:r>
           </w:p>
@@ -2035,6 +3865,9 @@
           </w:tcPr>
           <w:p>
             <w:r>
+              <w:rPr>
+                <w:sz w:val="18"/>
+              </w:rPr>
               <w:t>USN-3</w:t>
             </w:r>
           </w:p>
@@ -2045,6 +3878,9 @@
           </w:tcPr>
           <w:p>
             <w:r>
+              <w:rPr>
+                <w:sz w:val="18"/>
+              </w:rPr>
               <w:t>As a support user, I want support tickets to be associated with Accounts and Contacts so that the latest customer ticket can be identified for analysis.</w:t>
             </w:r>
           </w:p>
@@ -2055,6 +3891,9 @@
           </w:tcPr>
           <w:p>
             <w:r>
+              <w:rPr>
+                <w:sz w:val="18"/>
+              </w:rPr>
               <w:t>3</w:t>
             </w:r>
           </w:p>
@@ -2065,6 +3904,9 @@
           </w:tcPr>
           <w:p>
             <w:r>
+              <w:rPr>
+                <w:sz w:val="18"/>
+              </w:rPr>
               <w:t>High</w:t>
             </w:r>
           </w:p>
@@ -2075,6 +3917,9 @@
           </w:tcPr>
           <w:p>
             <w:r>
+              <w:rPr>
+                <w:sz w:val="18"/>
+              </w:rPr>
               <w:t>Vikash V</w:t>
             </w:r>
           </w:p>
@@ -2087,6 +3932,9 @@
           </w:tcPr>
           <w:p>
             <w:r>
+              <w:rPr>
+                <w:sz w:val="18"/>
+              </w:rPr>
               <w:t>Sprint-3</w:t>
             </w:r>
           </w:p>
@@ -2097,6 +3945,9 @@
           </w:tcPr>
           <w:p>
             <w:r>
+              <w:rPr>
+                <w:sz w:val="18"/>
+              </w:rPr>
               <w:t>Automation</w:t>
             </w:r>
           </w:p>
@@ -2107,6 +3958,9 @@
           </w:tcPr>
           <w:p>
             <w:r>
+              <w:rPr>
+                <w:sz w:val="18"/>
+              </w:rPr>
               <w:t>USN-4</w:t>
             </w:r>
           </w:p>
@@ -2117,6 +3971,9 @@
           </w:tcPr>
           <w:p>
             <w:r>
+              <w:rPr>
+                <w:sz w:val="18"/>
+              </w:rPr>
               <w:t>As a support agent, I want an Auto-Launched Flow to retrieve the latest ticket and analyze its description so that ticket priority can be determined automatically.</w:t>
             </w:r>
           </w:p>
@@ -2127,6 +3984,9 @@
           </w:tcPr>
           <w:p>
             <w:r>
+              <w:rPr>
+                <w:sz w:val="18"/>
+              </w:rPr>
               <w:t>5</w:t>
             </w:r>
           </w:p>
@@ -2137,6 +3997,9 @@
           </w:tcPr>
           <w:p>
             <w:r>
+              <w:rPr>
+                <w:sz w:val="18"/>
+              </w:rPr>
               <w:t>High</w:t>
             </w:r>
           </w:p>
@@ -2147,6 +4010,9 @@
           </w:tcPr>
           <w:p>
             <w:r>
+              <w:rPr>
+                <w:sz w:val="18"/>
+              </w:rPr>
               <w:t>Pugazhendhi P</w:t>
             </w:r>
           </w:p>
@@ -2159,6 +4025,9 @@
           </w:tcPr>
           <w:p>
             <w:r>
+              <w:rPr>
+                <w:sz w:val="18"/>
+              </w:rPr>
               <w:t>Sprint-3</w:t>
             </w:r>
           </w:p>
@@ -2169,6 +4038,9 @@
           </w:tcPr>
           <w:p>
             <w:r>
+              <w:rPr>
+                <w:sz w:val="18"/>
+              </w:rPr>
               <w:t>Automation</w:t>
             </w:r>
           </w:p>
@@ -2179,6 +4051,9 @@
           </w:tcPr>
           <w:p>
             <w:r>
+              <w:rPr>
+                <w:sz w:val="18"/>
+              </w:rPr>
               <w:t>USN-5</w:t>
             </w:r>
           </w:p>
@@ -2189,6 +4064,9 @@
           </w:tcPr>
           <w:p>
             <w:r>
+              <w:rPr>
+                <w:sz w:val="18"/>
+              </w:rPr>
               <w:t>As a support agent, I want tickets to be automatically classified as High, Medium, or Low based on configured urgency conditions so that critical issues receive attention first.</w:t>
             </w:r>
           </w:p>
@@ -2199,6 +4077,9 @@
           </w:tcPr>
           <w:p>
             <w:r>
+              <w:rPr>
+                <w:sz w:val="18"/>
+              </w:rPr>
               <w:t>5</w:t>
             </w:r>
           </w:p>
@@ -2209,6 +4090,9 @@
           </w:tcPr>
           <w:p>
             <w:r>
+              <w:rPr>
+                <w:sz w:val="18"/>
+              </w:rPr>
               <w:t>High</w:t>
             </w:r>
           </w:p>
@@ -2219,6 +4103,9 @@
           </w:tcPr>
           <w:p>
             <w:r>
+              <w:rPr>
+                <w:sz w:val="18"/>
+              </w:rPr>
               <w:t>Aswin M</w:t>
             </w:r>
           </w:p>
@@ -2231,6 +4118,9 @@
           </w:tcPr>
           <w:p>
             <w:r>
+              <w:rPr>
+                <w:sz w:val="18"/>
+              </w:rPr>
               <w:t>Sprint-4</w:t>
             </w:r>
           </w:p>
@@ -2241,6 +4131,9 @@
           </w:tcPr>
           <w:p>
             <w:r>
+              <w:rPr>
+                <w:sz w:val="18"/>
+              </w:rPr>
               <w:t>Agentforce &amp; Automation</w:t>
             </w:r>
           </w:p>
@@ -2251,6 +4144,9 @@
           </w:tcPr>
           <w:p>
             <w:r>
+              <w:rPr>
+                <w:sz w:val="18"/>
+              </w:rPr>
               <w:t>USN-6</w:t>
             </w:r>
           </w:p>
@@ -2261,6 +4157,9 @@
           </w:tcPr>
           <w:p>
             <w:r>
+              <w:rPr>
+                <w:sz w:val="18"/>
+              </w:rPr>
               <w:t>As an AI Agent (Agentforce), I want to analyze support ticket details and trigger the backend Flow so that manual ticket prioritization is reduced.</w:t>
             </w:r>
           </w:p>
@@ -2271,6 +4170,9 @@
           </w:tcPr>
           <w:p>
             <w:r>
+              <w:rPr>
+                <w:sz w:val="18"/>
+              </w:rPr>
               <w:t>8</w:t>
             </w:r>
           </w:p>
@@ -2281,6 +4183,9 @@
           </w:tcPr>
           <w:p>
             <w:r>
+              <w:rPr>
+                <w:sz w:val="18"/>
+              </w:rPr>
               <w:t>High</w:t>
             </w:r>
           </w:p>
@@ -2291,6 +4196,9 @@
           </w:tcPr>
           <w:p>
             <w:r>
+              <w:rPr>
+                <w:sz w:val="18"/>
+              </w:rPr>
               <w:t>Premkumar P</w:t>
             </w:r>
           </w:p>
@@ -2303,6 +4211,9 @@
           </w:tcPr>
           <w:p>
             <w:r>
+              <w:rPr>
+                <w:sz w:val="18"/>
+              </w:rPr>
               <w:t>Sprint-4</w:t>
             </w:r>
           </w:p>
@@ -2313,6 +4224,9 @@
           </w:tcPr>
           <w:p>
             <w:r>
+              <w:rPr>
+                <w:sz w:val="18"/>
+              </w:rPr>
               <w:t>Task &amp; Assignment</w:t>
             </w:r>
           </w:p>
@@ -2323,6 +4237,9 @@
           </w:tcPr>
           <w:p>
             <w:r>
+              <w:rPr>
+                <w:sz w:val="18"/>
+              </w:rPr>
               <w:t>USN-7</w:t>
             </w:r>
           </w:p>
@@ -2333,6 +4250,9 @@
           </w:tcPr>
           <w:p>
             <w:r>
+              <w:rPr>
+                <w:sz w:val="18"/>
+              </w:rPr>
               <w:t>As a support manager, I want High-priority tickets to automatically create an urgent handling task and assign the appropriate support level so that critical tickets are handled quickly.</w:t>
             </w:r>
           </w:p>
@@ -2343,6 +4263,9 @@
           </w:tcPr>
           <w:p>
             <w:r>
+              <w:rPr>
+                <w:sz w:val="18"/>
+              </w:rPr>
               <w:t>5</w:t>
             </w:r>
           </w:p>
@@ -2353,6 +4276,9 @@
           </w:tcPr>
           <w:p>
             <w:r>
+              <w:rPr>
+                <w:sz w:val="18"/>
+              </w:rPr>
               <w:t>High</w:t>
             </w:r>
           </w:p>
@@ -2363,6 +4289,9 @@
           </w:tcPr>
           <w:p>
             <w:r>
+              <w:rPr>
+                <w:sz w:val="18"/>
+              </w:rPr>
               <w:t>Bharath Kumar P</w:t>
             </w:r>
           </w:p>
@@ -2375,6 +4304,9 @@
           </w:tcPr>
           <w:p>
             <w:r>
+              <w:rPr>
+                <w:sz w:val="18"/>
+              </w:rPr>
               <w:t>Sprint-5</w:t>
             </w:r>
           </w:p>
@@ -2385,6 +4317,9 @@
           </w:tcPr>
           <w:p>
             <w:r>
+              <w:rPr>
+                <w:sz w:val="18"/>
+              </w:rPr>
               <w:t>SLA Management</w:t>
             </w:r>
           </w:p>
@@ -2395,6 +4330,9 @@
           </w:tcPr>
           <w:p>
             <w:r>
+              <w:rPr>
+                <w:sz w:val="18"/>
+              </w:rPr>
               <w:t>USN-8</w:t>
             </w:r>
           </w:p>
@@ -2405,6 +4343,9 @@
           </w:tcPr>
           <w:p>
             <w:r>
+              <w:rPr>
+                <w:sz w:val="18"/>
+              </w:rPr>
               <w:t>As a support manager, I want the system to check SLA breach risk for older unresolved tickets so that potential SLA issues can be identified.</w:t>
             </w:r>
           </w:p>
@@ -2415,6 +4356,9 @@
           </w:tcPr>
           <w:p>
             <w:r>
+              <w:rPr>
+                <w:sz w:val="18"/>
+              </w:rPr>
               <w:t>5</w:t>
             </w:r>
           </w:p>
@@ -2425,6 +4369,9 @@
           </w:tcPr>
           <w:p>
             <w:r>
+              <w:rPr>
+                <w:sz w:val="18"/>
+              </w:rPr>
               <w:t>Medium</w:t>
             </w:r>
           </w:p>
@@ -2435,6 +4382,9 @@
           </w:tcPr>
           <w:p>
             <w:r>
+              <w:rPr>
+                <w:sz w:val="18"/>
+              </w:rPr>
               <w:t>Vikash V</w:t>
             </w:r>
           </w:p>
@@ -2447,6 +4397,9 @@
           </w:tcPr>
           <w:p>
             <w:r>
+              <w:rPr>
+                <w:sz w:val="18"/>
+              </w:rPr>
               <w:t>Sprint-6</w:t>
             </w:r>
           </w:p>
@@ -2457,6 +4410,9 @@
           </w:tcPr>
           <w:p>
             <w:r>
+              <w:rPr>
+                <w:sz w:val="18"/>
+              </w:rPr>
               <w:t>Agentforce &amp; Conversational Support</w:t>
             </w:r>
           </w:p>
@@ -2467,6 +4423,9 @@
           </w:tcPr>
           <w:p>
             <w:r>
+              <w:rPr>
+                <w:sz w:val="18"/>
+              </w:rPr>
               <w:t>USN-9</w:t>
             </w:r>
           </w:p>
@@ -2477,6 +4436,9 @@
           </w:tcPr>
           <w:p>
             <w:r>
+              <w:rPr>
+                <w:sz w:val="18"/>
+              </w:rPr>
               <w:t>As a support user, I want to provide an Account Name to Agentforce and receive the ticket ID, priority, assigned agent, and action message so that I can understand the ticket handling outcome conversationally.</w:t>
             </w:r>
           </w:p>
@@ -2487,6 +4449,9 @@
           </w:tcPr>
           <w:p>
             <w:r>
+              <w:rPr>
+                <w:sz w:val="18"/>
+              </w:rPr>
               <w:t>5</w:t>
             </w:r>
           </w:p>
@@ -2497,6 +4462,9 @@
           </w:tcPr>
           <w:p>
             <w:r>
+              <w:rPr>
+                <w:sz w:val="18"/>
+              </w:rPr>
               <w:t>Medium</w:t>
             </w:r>
           </w:p>
@@ -2507,6 +4475,9 @@
           </w:tcPr>
           <w:p>
             <w:r>
+              <w:rPr>
+                <w:sz w:val="18"/>
+              </w:rPr>
               <w:t>Pugazhendhi P</w:t>
             </w:r>
           </w:p>
@@ -2515,8 +4486,11 @@
     </w:tbl>
     <w:p/>
     <w:p>
+      <w:pPr>
+        <w:pStyle w:val="Heading2"/>
+      </w:pPr>
       <w:r>
-        <w:t>Project Tracker, Velocity &amp; Burndown Chart</w:t>
+        <w:t>5.4 Project Tracker, Velocity &amp; Burndown Chart</w:t>
       </w:r>
     </w:p>
     <w:tbl>
@@ -2540,6 +4514,10 @@
           </w:tcPr>
           <w:p>
             <w:r>
+              <w:rPr>
+                <w:b/>
+                <w:sz w:val="18"/>
+              </w:rPr>
               <w:t>Sprint</w:t>
             </w:r>
           </w:p>
@@ -2550,6 +4528,10 @@
           </w:tcPr>
           <w:p>
             <w:r>
+              <w:rPr>
+                <w:b/>
+                <w:sz w:val="18"/>
+              </w:rPr>
               <w:t>Total Story Points</w:t>
             </w:r>
           </w:p>
@@ -2560,6 +4542,10 @@
           </w:tcPr>
           <w:p>
             <w:r>
+              <w:rPr>
+                <w:b/>
+                <w:sz w:val="18"/>
+              </w:rPr>
               <w:t>Duration</w:t>
             </w:r>
           </w:p>
@@ -2570,6 +4556,10 @@
           </w:tcPr>
           <w:p>
             <w:r>
+              <w:rPr>
+                <w:b/>
+                <w:sz w:val="18"/>
+              </w:rPr>
               <w:t>Sprint Start Date</w:t>
             </w:r>
           </w:p>
@@ -2580,6 +4570,10 @@
           </w:tcPr>
           <w:p>
             <w:r>
+              <w:rPr>
+                <w:b/>
+                <w:sz w:val="18"/>
+              </w:rPr>
               <w:t>Sprint End Date (Planned)</w:t>
             </w:r>
           </w:p>
@@ -2590,6 +4584,10 @@
           </w:tcPr>
           <w:p>
             <w:r>
+              <w:rPr>
+                <w:b/>
+                <w:sz w:val="18"/>
+              </w:rPr>
               <w:t>Story Points Completed</w:t>
             </w:r>
           </w:p>
@@ -2602,6 +4600,9 @@
           </w:tcPr>
           <w:p>
             <w:r>
+              <w:rPr>
+                <w:sz w:val="18"/>
+              </w:rPr>
               <w:t>Sprint-1</w:t>
             </w:r>
           </w:p>
@@ -2612,6 +4613,9 @@
           </w:tcPr>
           <w:p>
             <w:r>
+              <w:rPr>
+                <w:sz w:val="18"/>
+              </w:rPr>
               <w:t>3</w:t>
             </w:r>
           </w:p>
@@ -2622,6 +4626,9 @@
           </w:tcPr>
           <w:p>
             <w:r>
+              <w:rPr>
+                <w:sz w:val="18"/>
+              </w:rPr>
               <w:t>4 Days</w:t>
             </w:r>
           </w:p>
@@ -2632,6 +4639,9 @@
           </w:tcPr>
           <w:p>
             <w:r>
+              <w:rPr>
+                <w:sz w:val="18"/>
+              </w:rPr>
               <w:t>14 Sep 2026</w:t>
             </w:r>
           </w:p>
@@ -2642,6 +4652,9 @@
           </w:tcPr>
           <w:p>
             <w:r>
+              <w:rPr>
+                <w:sz w:val="18"/>
+              </w:rPr>
               <w:t>17 Sep 2026</w:t>
             </w:r>
           </w:p>
@@ -2652,6 +4665,9 @@
           </w:tcPr>
           <w:p>
             <w:r>
+              <w:rPr>
+                <w:sz w:val="18"/>
+              </w:rPr>
               <w:t>3</w:t>
             </w:r>
           </w:p>
@@ -2664,6 +4680,9 @@
           </w:tcPr>
           <w:p>
             <w:r>
+              <w:rPr>
+                <w:sz w:val="18"/>
+              </w:rPr>
               <w:t>Sprint-2</w:t>
             </w:r>
           </w:p>
@@ -2674,6 +4693,9 @@
           </w:tcPr>
           <w:p>
             <w:r>
+              <w:rPr>
+                <w:sz w:val="18"/>
+              </w:rPr>
               <w:t>8</w:t>
             </w:r>
           </w:p>
@@ -2684,6 +4706,9 @@
           </w:tcPr>
           <w:p>
             <w:r>
+              <w:rPr>
+                <w:sz w:val="18"/>
+              </w:rPr>
               <w:t>5 Days</w:t>
             </w:r>
           </w:p>
@@ -2694,6 +4719,9 @@
           </w:tcPr>
           <w:p>
             <w:r>
+              <w:rPr>
+                <w:sz w:val="18"/>
+              </w:rPr>
               <w:t>18 Sep 2026</w:t>
             </w:r>
           </w:p>
@@ -2704,6 +4732,9 @@
           </w:tcPr>
           <w:p>
             <w:r>
+              <w:rPr>
+                <w:sz w:val="18"/>
+              </w:rPr>
               <w:t>22 Sep 2026</w:t>
             </w:r>
           </w:p>
@@ -2714,6 +4745,9 @@
           </w:tcPr>
           <w:p>
             <w:r>
+              <w:rPr>
+                <w:sz w:val="18"/>
+              </w:rPr>
               <w:t>8</w:t>
             </w:r>
           </w:p>
@@ -2726,6 +4760,9 @@
           </w:tcPr>
           <w:p>
             <w:r>
+              <w:rPr>
+                <w:sz w:val="18"/>
+              </w:rPr>
               <w:t>Sprint-3</w:t>
             </w:r>
           </w:p>
@@ -2736,6 +4773,9 @@
           </w:tcPr>
           <w:p>
             <w:r>
+              <w:rPr>
+                <w:sz w:val="18"/>
+              </w:rPr>
               <w:t>10</w:t>
             </w:r>
           </w:p>
@@ -2746,6 +4786,9 @@
           </w:tcPr>
           <w:p>
             <w:r>
+              <w:rPr>
+                <w:sz w:val="18"/>
+              </w:rPr>
               <w:t>5 Days</w:t>
             </w:r>
           </w:p>
@@ -2756,6 +4799,9 @@
           </w:tcPr>
           <w:p>
             <w:r>
+              <w:rPr>
+                <w:sz w:val="18"/>
+              </w:rPr>
               <w:t>23 Sep 2026</w:t>
             </w:r>
           </w:p>
@@ -2766,6 +4812,9 @@
           </w:tcPr>
           <w:p>
             <w:r>
+              <w:rPr>
+                <w:sz w:val="18"/>
+              </w:rPr>
               <w:t>27 Sep 2026</w:t>
             </w:r>
           </w:p>
@@ -2776,6 +4825,9 @@
           </w:tcPr>
           <w:p>
             <w:r>
+              <w:rPr>
+                <w:sz w:val="18"/>
+              </w:rPr>
               <w:t>10</w:t>
             </w:r>
           </w:p>
@@ -2788,6 +4840,9 @@
           </w:tcPr>
           <w:p>
             <w:r>
+              <w:rPr>
+                <w:sz w:val="18"/>
+              </w:rPr>
               <w:t>Sprint-4</w:t>
             </w:r>
           </w:p>
@@ -2798,6 +4853,9 @@
           </w:tcPr>
           <w:p>
             <w:r>
+              <w:rPr>
+                <w:sz w:val="18"/>
+              </w:rPr>
               <w:t>13</w:t>
             </w:r>
           </w:p>
@@ -2808,6 +4866,9 @@
           </w:tcPr>
           <w:p>
             <w:r>
+              <w:rPr>
+                <w:sz w:val="18"/>
+              </w:rPr>
               <w:t>3 Days</w:t>
             </w:r>
           </w:p>
@@ -2818,6 +4879,9 @@
           </w:tcPr>
           <w:p>
             <w:r>
+              <w:rPr>
+                <w:sz w:val="18"/>
+              </w:rPr>
               <w:t>28 Sep 2026</w:t>
             </w:r>
           </w:p>
@@ -2828,6 +4892,9 @@
           </w:tcPr>
           <w:p>
             <w:r>
+              <w:rPr>
+                <w:sz w:val="18"/>
+              </w:rPr>
               <w:t>30 Sep 2026</w:t>
             </w:r>
           </w:p>
@@ -2838,6 +4905,9 @@
           </w:tcPr>
           <w:p>
             <w:r>
+              <w:rPr>
+                <w:sz w:val="18"/>
+              </w:rPr>
               <w:t>13</w:t>
             </w:r>
           </w:p>
@@ -2850,6 +4920,9 @@
           </w:tcPr>
           <w:p>
             <w:r>
+              <w:rPr>
+                <w:sz w:val="18"/>
+              </w:rPr>
               <w:t>Sprint-5</w:t>
             </w:r>
           </w:p>
@@ -2860,6 +4933,9 @@
           </w:tcPr>
           <w:p>
             <w:r>
+              <w:rPr>
+                <w:sz w:val="18"/>
+              </w:rPr>
               <w:t>5</w:t>
             </w:r>
           </w:p>
@@ -2870,6 +4946,9 @@
           </w:tcPr>
           <w:p>
             <w:r>
+              <w:rPr>
+                <w:sz w:val="18"/>
+              </w:rPr>
               <w:t>1 Day</w:t>
             </w:r>
           </w:p>
@@ -2880,6 +4959,9 @@
           </w:tcPr>
           <w:p>
             <w:r>
+              <w:rPr>
+                <w:sz w:val="18"/>
+              </w:rPr>
               <w:t>01 Oct 2026</w:t>
             </w:r>
           </w:p>
@@ -2890,6 +4972,9 @@
           </w:tcPr>
           <w:p>
             <w:r>
+              <w:rPr>
+                <w:sz w:val="18"/>
+              </w:rPr>
               <w:t>01 Oct 2026</w:t>
             </w:r>
           </w:p>
@@ -2900,6 +4985,9 @@
           </w:tcPr>
           <w:p>
             <w:r>
+              <w:rPr>
+                <w:sz w:val="18"/>
+              </w:rPr>
               <w:t>5</w:t>
             </w:r>
           </w:p>
@@ -2912,6 +5000,9 @@
           </w:tcPr>
           <w:p>
             <w:r>
+              <w:rPr>
+                <w:sz w:val="18"/>
+              </w:rPr>
               <w:t>Sprint-6</w:t>
             </w:r>
           </w:p>
@@ -2922,6 +5013,9 @@
           </w:tcPr>
           <w:p>
             <w:r>
+              <w:rPr>
+                <w:sz w:val="18"/>
+              </w:rPr>
               <w:t>5</w:t>
             </w:r>
           </w:p>
@@ -2932,6 +5026,9 @@
           </w:tcPr>
           <w:p>
             <w:r>
+              <w:rPr>
+                <w:sz w:val="18"/>
+              </w:rPr>
               <w:t>2 Days</w:t>
             </w:r>
           </w:p>
@@ -2942,6 +5039,9 @@
           </w:tcPr>
           <w:p>
             <w:r>
+              <w:rPr>
+                <w:sz w:val="18"/>
+              </w:rPr>
               <w:t>02 Oct 2026</w:t>
             </w:r>
           </w:p>
@@ -2952,6 +5052,9 @@
           </w:tcPr>
           <w:p>
             <w:r>
+              <w:rPr>
+                <w:sz w:val="18"/>
+              </w:rPr>
               <w:t>03 Oct 2026</w:t>
             </w:r>
           </w:p>
@@ -2962,6 +5065,9 @@
           </w:tcPr>
           <w:p>
             <w:r>
+              <w:rPr>
+                <w:sz w:val="18"/>
+              </w:rPr>
               <w:t>5</w:t>
             </w:r>
           </w:p>

</xml_diff>